<commit_message>
cambios en bitacora y carga de codigo fuente
</commit_message>
<xml_diff>
--- a/00_Gestion_Proyecto/Bitacoras/Bitacora_Semana_3.docx
+++ b/00_Gestion_Proyecto/Bitacoras/Bitacora_Semana_3.docx
@@ -1,6 +1,6 @@
 
 <file path=word/document.xml><?xml version="1.0" encoding="utf-8"?>
-<w:document xmlns:wpc="http://schemas.microsoft.com/office/word/2010/wordprocessingCanvas" xmlns:cx="http://schemas.microsoft.com/office/drawing/2014/chartex" xmlns:cx1="http://schemas.microsoft.com/office/drawing/2015/9/8/chartex" xmlns:cx2="http://schemas.microsoft.com/office/drawing/2015/10/21/chartex" xmlns:cx3="http://schemas.microsoft.com/office/drawing/2016/5/9/chartex" xmlns:cx4="http://schemas.microsoft.com/office/drawing/2016/5/10/chartex" xmlns:cx5="http://schemas.microsoft.com/office/drawing/2016/5/11/chartex" xmlns:cx6="http://schemas.microsoft.com/office/drawing/2016/5/12/chartex" xmlns:cx7="http://schemas.microsoft.com/office/drawing/2016/5/13/chartex" xmlns:cx8="http://schemas.microsoft.com/office/drawing/2016/5/14/chartex" xmlns:mc="http://schemas.openxmlformats.org/markup-compatibility/2006" xmlns:aink="http://schemas.microsoft.com/office/drawing/2016/ink" xmlns:am3d="http://schemas.microsoft.com/office/drawing/2017/model3d" xmlns:o="urn:schemas-microsoft-com:office:office" xmlns:oel="http://schemas.microsoft.com/office/2019/extlst" xmlns:r="http://schemas.openxmlformats.org/officeDocument/2006/relationships" xmlns:m="http://schemas.openxmlformats.org/officeDocument/2006/math" xmlns:v="urn:schemas-microsoft-com:vml" xmlns:wp14="http://schemas.microsoft.com/office/word/2010/wordprocessingDrawing" xmlns:wp="http://schemas.openxmlformats.org/drawingml/2006/wordprocessingDrawing" xmlns:w10="urn:schemas-microsoft-com:office:word" xmlns:w="http://schemas.openxmlformats.org/wordprocessingml/2006/main" xmlns:w14="http://schemas.microsoft.com/office/word/2010/wordml" xmlns:w15="http://schemas.microsoft.com/office/word/2012/wordml" xmlns:w16cex="http://schemas.microsoft.com/office/word/2018/wordml/cex" xmlns:w16cid="http://schemas.microsoft.com/office/word/2016/wordml/cid" xmlns:w16="http://schemas.microsoft.com/office/word/2018/wordml" xmlns:w16du="http://schemas.microsoft.com/office/word/2023/wordml/word16du" xmlns:w16sdtdh="http://schemas.microsoft.com/office/word/2020/wordml/sdtdatahash" xmlns:w16sdtfl="http://schemas.microsoft.com/office/word/2024/wordml/sdtformatlock" xmlns:w16se="http://schemas.microsoft.com/office/word/2015/wordml/symex" xmlns:wpg="http://schemas.microsoft.com/office/word/2010/wordprocessingGroup" xmlns:wpi="http://schemas.microsoft.com/office/word/2010/wordprocessingInk" xmlns:wne="http://schemas.microsoft.com/office/word/2006/wordml" xmlns:wps="http://schemas.microsoft.com/office/word/2010/wordprocessingShape" mc:Ignorable="w14 w15 w16se w16cid w16 w16cex w16sdtdh w16sdtfl w16du wp14">
+<w:document xmlns:wpc="http://schemas.microsoft.com/office/word/2010/wordprocessingCanvas" xmlns:cx="http://schemas.microsoft.com/office/drawing/2014/chartex" xmlns:cx1="http://schemas.microsoft.com/office/drawing/2015/9/8/chartex" xmlns:cx2="http://schemas.microsoft.com/office/drawing/2015/10/21/chartex" xmlns:cx3="http://schemas.microsoft.com/office/drawing/2016/5/9/chartex" xmlns:cx4="http://schemas.microsoft.com/office/drawing/2016/5/10/chartex" xmlns:cx5="http://schemas.microsoft.com/office/drawing/2016/5/11/chartex" xmlns:cx6="http://schemas.microsoft.com/office/drawing/2016/5/12/chartex" xmlns:cx7="http://schemas.microsoft.com/office/drawing/2016/5/13/chartex" xmlns:cx8="http://schemas.microsoft.com/office/drawing/2016/5/14/chartex" xmlns:mc="http://schemas.openxmlformats.org/markup-compatibility/2006" xmlns:aink="http://schemas.microsoft.com/office/drawing/2016/ink" xmlns:am3d="http://schemas.microsoft.com/office/drawing/2017/model3d" xmlns:o="urn:schemas-microsoft-com:office:office" xmlns:r="http://schemas.openxmlformats.org/officeDocument/2006/relationships" xmlns:m="http://schemas.openxmlformats.org/officeDocument/2006/math" xmlns:v="urn:schemas-microsoft-com:vml" xmlns:wp14="http://schemas.microsoft.com/office/word/2010/wordprocessingDrawing" xmlns:wp="http://schemas.openxmlformats.org/drawingml/2006/wordprocessingDrawing" xmlns:w10="urn:schemas-microsoft-com:office:word" xmlns:w="http://schemas.openxmlformats.org/wordprocessingml/2006/main" xmlns:w14="http://schemas.microsoft.com/office/word/2010/wordml" xmlns:w15="http://schemas.microsoft.com/office/word/2012/wordml" xmlns:w16cex="http://schemas.microsoft.com/office/word/2018/wordml/cex" xmlns:w16cid="http://schemas.microsoft.com/office/word/2016/wordml/cid" xmlns:w16="http://schemas.microsoft.com/office/word/2018/wordml" xmlns:w16sdtdh="http://schemas.microsoft.com/office/word/2020/wordml/sdtdatahash" xmlns:w16se="http://schemas.microsoft.com/office/word/2015/wordml/symex" xmlns:wpg="http://schemas.microsoft.com/office/word/2010/wordprocessingGroup" xmlns:wpi="http://schemas.microsoft.com/office/word/2010/wordprocessingInk" xmlns:wne="http://schemas.microsoft.com/office/word/2006/wordml" xmlns:wps="http://schemas.microsoft.com/office/word/2010/wordprocessingShape" mc:Ignorable="w14 w15 w16se w16cid w16 w16cex w16sdtdh wp14">
   <w:body>
     <w:p>
       <w:pPr>
@@ -102,7 +102,14 @@
                 <w:sz w:val="20"/>
                 <w:szCs w:val="20"/>
               </w:rPr>
-              <w:t>Esta versión íntegra elementos de control grupal y trazabilidad individual para sustentar la evaluación del desempeño técnico, el cumplimiento, la participación y los aportes verificables de cada integrante del equipo.</w:t>
+              <w:t xml:space="preserve">Esta versión íntegra elementos de control grupal y trazabilidad individual para sustentar la </w:t>
+            </w:r>
+            <w:r>
+              <w:rPr>
+                <w:sz w:val="20"/>
+                <w:szCs w:val="20"/>
+              </w:rPr>
+              <w:t>evaluación del desempeño técnico, el cumplimiento, la participación y los aportes verificables de cada integrante del equipo.</w:t>
             </w:r>
           </w:p>
         </w:tc>
@@ -224,7 +231,10 @@
               <w:spacing w:line="276" w:lineRule="auto"/>
             </w:pPr>
             <w:r>
-              <w:t>IAM Avanzado y Zero Trust – Plataforma de Gestión de Identidades y Acceso seguro en la Nube</w:t>
+              <w:t xml:space="preserve">IAM Avanzado y Zero Trust – </w:t>
+            </w:r>
+            <w:r>
+              <w:t>Plataforma de Gestión de Identidades y Acceso seguro en la Nube</w:t>
             </w:r>
           </w:p>
         </w:tc>
@@ -334,8 +344,13 @@
               <w:spacing w:line="276" w:lineRule="auto"/>
             </w:pPr>
             <w:r>
-              <w:t>Carlos Guillermo Rodriguez</w:t>
-            </w:r>
+              <w:t xml:space="preserve">Carlos Guillermo </w:t>
+            </w:r>
+            <w:proofErr w:type="spellStart"/>
+            <w:r>
+              <w:t>Rodriguez</w:t>
+            </w:r>
+            <w:proofErr w:type="spellEnd"/>
           </w:p>
         </w:tc>
       </w:tr>
@@ -494,7 +509,30 @@
                 <w:sz w:val="20"/>
                 <w:szCs w:val="20"/>
               </w:rPr>
-              <w:t>La bitácora debe completarse semanalmente. Las evidencias deben ser concretas, atribuibles y verificables: enlaces, commits, rutas de archivos, capturas, pruebas, documentos o configuraciones. No se recomienda registrar aportes genéricos sin evidencia técnica.</w:t>
+              <w:t xml:space="preserve">La bitácora debe completarse semanalmente. Las evidencias deben ser concretas, atribuibles y verificables: enlaces, </w:t>
+            </w:r>
+            <w:proofErr w:type="spellStart"/>
+            <w:r>
+              <w:rPr>
+                <w:sz w:val="20"/>
+                <w:szCs w:val="20"/>
+              </w:rPr>
+              <w:t>commits</w:t>
+            </w:r>
+            <w:proofErr w:type="spellEnd"/>
+            <w:r>
+              <w:rPr>
+                <w:sz w:val="20"/>
+                <w:szCs w:val="20"/>
+              </w:rPr>
+              <w:t>, rutas de archivos, capturas, pruebas, documentos o configuraciones. No se recomienda registrar aportes genérico</w:t>
+            </w:r>
+            <w:r>
+              <w:rPr>
+                <w:sz w:val="20"/>
+                <w:szCs w:val="20"/>
+              </w:rPr>
+              <w:t>s sin evidencia técnica.</w:t>
             </w:r>
           </w:p>
         </w:tc>
@@ -688,7 +726,55 @@
                 <w:sz w:val="20"/>
                 <w:szCs w:val="20"/>
               </w:rPr>
-              <w:t xml:space="preserve"> Neldy Liliana Hernandez, Luis Fernando Sánchez, Danny Moreno, Iván Palacios y Lissete Zapata</w:t>
+              <w:t xml:space="preserve"> </w:t>
+            </w:r>
+            <w:proofErr w:type="spellStart"/>
+            <w:r>
+              <w:rPr>
+                <w:sz w:val="20"/>
+                <w:szCs w:val="20"/>
+              </w:rPr>
+              <w:t>Neldy</w:t>
+            </w:r>
+            <w:proofErr w:type="spellEnd"/>
+            <w:r>
+              <w:rPr>
+                <w:sz w:val="20"/>
+                <w:szCs w:val="20"/>
+              </w:rPr>
+              <w:t xml:space="preserve"> Liliana </w:t>
+            </w:r>
+            <w:proofErr w:type="spellStart"/>
+            <w:r>
+              <w:rPr>
+                <w:sz w:val="20"/>
+                <w:szCs w:val="20"/>
+              </w:rPr>
+              <w:t>Hernandez</w:t>
+            </w:r>
+            <w:proofErr w:type="spellEnd"/>
+            <w:r>
+              <w:rPr>
+                <w:sz w:val="20"/>
+                <w:szCs w:val="20"/>
+              </w:rPr>
+              <w:t xml:space="preserve">, Luis Fernando Sánchez, Danny Moreno, Iván Palacios y </w:t>
+            </w:r>
+            <w:proofErr w:type="spellStart"/>
+            <w:r>
+              <w:rPr>
+                <w:sz w:val="20"/>
+                <w:szCs w:val="20"/>
+              </w:rPr>
+              <w:t>Lissete</w:t>
+            </w:r>
+            <w:proofErr w:type="spellEnd"/>
+            <w:r>
+              <w:rPr>
+                <w:sz w:val="20"/>
+                <w:szCs w:val="20"/>
+              </w:rPr>
+              <w:t xml:space="preserve"> Zapata</w:t>
             </w:r>
           </w:p>
         </w:tc>
@@ -851,7 +937,14 @@
                 <w:sz w:val="20"/>
                 <w:szCs w:val="20"/>
               </w:rPr>
-              <w:t xml:space="preserve"> Implementación del Núcleo IAM y Políticas de Acceso</w:t>
+              <w:t xml:space="preserve"> Implementación del Núc</w:t>
+            </w:r>
+            <w:r>
+              <w:rPr>
+                <w:sz w:val="20"/>
+                <w:szCs w:val="20"/>
+              </w:rPr>
+              <w:t>leo IAM y Políticas de Acceso</w:t>
             </w:r>
           </w:p>
         </w:tc>
@@ -971,7 +1064,15 @@
                 <w:szCs w:val="20"/>
               </w:rPr>
               <w:br/>
-              <w:t>• Consolidar el entregable de la Fase 2.</w:t>
+              <w:t>•</w:t>
+            </w:r>
+            <w:r>
+              <w:rPr>
+                <w:color w:val="000000"/>
+                <w:sz w:val="20"/>
+                <w:szCs w:val="20"/>
+              </w:rPr>
+              <w:t xml:space="preserve"> Consolidar el entregable de la Fase 2.</w:t>
             </w:r>
           </w:p>
         </w:tc>
@@ -1124,7 +1225,14 @@
                 <w:sz w:val="20"/>
                 <w:szCs w:val="20"/>
               </w:rPr>
-              <w:t>En ejecución, actividades desarrolladas conforme al cronograma.</w:t>
+              <w:t xml:space="preserve">En </w:t>
+            </w:r>
+            <w:r>
+              <w:rPr>
+                <w:sz w:val="20"/>
+                <w:szCs w:val="20"/>
+              </w:rPr>
+              <w:t>ejecución, actividades desarrolladas conforme al cronograma.</w:t>
             </w:r>
           </w:p>
         </w:tc>
@@ -1244,7 +1352,17 @@
                 <w:sz w:val="22"/>
                 <w:szCs w:val="22"/>
               </w:rPr>
-              <w:t>2. Actividades realizadas</w:t>
+              <w:t xml:space="preserve">2. Actividades </w:t>
+            </w:r>
+            <w:r>
+              <w:rPr>
+                <w:b/>
+                <w:bCs/>
+                <w:color w:val="FFFFFF"/>
+                <w:sz w:val="22"/>
+                <w:szCs w:val="22"/>
+              </w:rPr>
+              <w:t>realizadas</w:t>
             </w:r>
           </w:p>
         </w:tc>
@@ -1461,8 +1579,13 @@
               <w:spacing w:after="0"/>
               <w:jc w:val="center"/>
             </w:pPr>
-            <w:r>
-              <w:t>Neldy Liliana Hernández</w:t>
+            <w:proofErr w:type="spellStart"/>
+            <w:r>
+              <w:t>Neldy</w:t>
+            </w:r>
+            <w:proofErr w:type="spellEnd"/>
+            <w:r>
+              <w:t xml:space="preserve"> Liliana Hernández</w:t>
             </w:r>
           </w:p>
         </w:tc>
@@ -1555,8 +1678,13 @@
                 <w:szCs w:val="20"/>
               </w:rPr>
             </w:pPr>
-            <w:r>
-              <w:t>Neldy Liliana Hernández</w:t>
+            <w:proofErr w:type="spellStart"/>
+            <w:r>
+              <w:t>Neldy</w:t>
+            </w:r>
+            <w:proofErr w:type="spellEnd"/>
+            <w:r>
+              <w:t xml:space="preserve"> Liliana Hernández</w:t>
             </w:r>
           </w:p>
         </w:tc>
@@ -1654,8 +1782,33 @@
                 <w:sz w:val="20"/>
                 <w:szCs w:val="20"/>
               </w:rPr>
-              <w:t xml:space="preserve"> Neldy Liliana Hernandez</w:t>
-            </w:r>
+              <w:t xml:space="preserve"> </w:t>
+            </w:r>
+            <w:proofErr w:type="spellStart"/>
+            <w:r>
+              <w:rPr>
+                <w:sz w:val="20"/>
+                <w:szCs w:val="20"/>
+              </w:rPr>
+              <w:t>Neldy</w:t>
+            </w:r>
+            <w:proofErr w:type="spellEnd"/>
+            <w:r>
+              <w:rPr>
+                <w:sz w:val="20"/>
+                <w:szCs w:val="20"/>
+              </w:rPr>
+              <w:t xml:space="preserve"> Liliana </w:t>
+            </w:r>
+            <w:proofErr w:type="spellStart"/>
+            <w:r>
+              <w:rPr>
+                <w:sz w:val="20"/>
+                <w:szCs w:val="20"/>
+              </w:rPr>
+              <w:t>Hernandez</w:t>
+            </w:r>
+            <w:proofErr w:type="spellEnd"/>
           </w:p>
         </w:tc>
         <w:tc>
@@ -1698,7 +1851,10 @@
               <w:spacing w:after="0"/>
             </w:pPr>
             <w:r>
-              <w:t>Configuración del proveedor IAM</w:t>
+              <w:t xml:space="preserve">Configuración del </w:t>
+            </w:r>
+            <w:r>
+              <w:t>proveedor IAM</w:t>
             </w:r>
           </w:p>
         </w:tc>
@@ -1761,7 +1917,14 @@
                   <w:color w:val="1155CC"/>
                   <w:u w:val="single"/>
                 </w:rPr>
-                <w:t>Configuracion_IAM.docx</w:t>
+                <w:t>Configuraci</w:t>
+              </w:r>
+              <w:r>
+                <w:rPr>
+                  <w:color w:val="1155CC"/>
+                  <w:u w:val="single"/>
+                </w:rPr>
+                <w:t>on_IAM.docx</w:t>
               </w:r>
             </w:hyperlink>
           </w:p>
@@ -1842,8 +2005,17 @@
                 <w:sz w:val="20"/>
                 <w:szCs w:val="20"/>
               </w:rPr>
-              <w:t>02_Backend_Cloud/Base_Datos</w:t>
-            </w:r>
+              <w:t>02_Backend_Cloud/</w:t>
+            </w:r>
+            <w:proofErr w:type="spellStart"/>
+            <w:r>
+              <w:rPr>
+                <w:sz w:val="20"/>
+                <w:szCs w:val="20"/>
+              </w:rPr>
+              <w:t>Base_Datos</w:t>
+            </w:r>
+            <w:proofErr w:type="spellEnd"/>
           </w:p>
         </w:tc>
       </w:tr>
@@ -1921,7 +2093,15 @@
           </w:tcPr>
           <w:p>
             <w:r>
-              <w:t>02_Backend_Cloud/Investigacion/Fase 2 - Documento Técnico Backend IAM Zero Trust.docx</w:t>
+              <w:t>02_Backend_Cloud/</w:t>
+            </w:r>
+            <w:proofErr w:type="spellStart"/>
+            <w:r>
+              <w:t>Investigacion</w:t>
+            </w:r>
+            <w:proofErr w:type="spellEnd"/>
+            <w:r>
+              <w:t>/Fase 2 - Documento Técnico Backend IAM Zero Trust.docx</w:t>
             </w:r>
           </w:p>
         </w:tc>
@@ -2023,8 +2203,17 @@
                 <w:sz w:val="20"/>
                 <w:szCs w:val="20"/>
               </w:rPr>
-              <w:t>02_Backend_Cloud/Base_Datos</w:t>
-            </w:r>
+              <w:t>02_Backend_Cloud/</w:t>
+            </w:r>
+            <w:proofErr w:type="spellStart"/>
+            <w:r>
+              <w:rPr>
+                <w:sz w:val="20"/>
+                <w:szCs w:val="20"/>
+              </w:rPr>
+              <w:t>Base_Datos</w:t>
+            </w:r>
+            <w:proofErr w:type="spellEnd"/>
           </w:p>
         </w:tc>
       </w:tr>
@@ -2047,7 +2236,15 @@
               <w:spacing w:after="0"/>
             </w:pPr>
             <w:r>
-              <w:t>Desarrollar endpoints CRUD</w:t>
+              <w:t xml:space="preserve">Desarrollar </w:t>
+            </w:r>
+            <w:proofErr w:type="spellStart"/>
+            <w:r>
+              <w:t>endpoints</w:t>
+            </w:r>
+            <w:proofErr w:type="spellEnd"/>
+            <w:r>
+              <w:t xml:space="preserve"> CRUD</w:t>
             </w:r>
           </w:p>
         </w:tc>
@@ -2113,7 +2310,23 @@
                 <w:sz w:val="20"/>
                 <w:szCs w:val="20"/>
               </w:rPr>
-              <w:t>02_Backend_Cloud/Investigacion/Fase 2 - Documento Técnico Backend IAM Zero Trust.docx</w:t>
+              <w:t>02_Backend_Cloud/</w:t>
+            </w:r>
+            <w:proofErr w:type="spellStart"/>
+            <w:r>
+              <w:rPr>
+                <w:sz w:val="20"/>
+                <w:szCs w:val="20"/>
+              </w:rPr>
+              <w:t>Investigacion</w:t>
+            </w:r>
+            <w:proofErr w:type="spellEnd"/>
+            <w:r>
+              <w:rPr>
+                <w:sz w:val="20"/>
+                <w:szCs w:val="20"/>
+              </w:rPr>
+              <w:t>/Fase 2 - Documento Técnico Backend IAM Zero Trust.docx</w:t>
             </w:r>
           </w:p>
         </w:tc>
@@ -2156,7 +2369,15 @@
               <w:spacing w:after="0"/>
             </w:pPr>
             <w:r>
-              <w:t>Validar que los endpoints respondan correctamente con y sin token.</w:t>
+              <w:t xml:space="preserve">Validar que los </w:t>
+            </w:r>
+            <w:proofErr w:type="spellStart"/>
+            <w:r>
+              <w:t>endpoints</w:t>
+            </w:r>
+            <w:proofErr w:type="spellEnd"/>
+            <w:r>
+              <w:t xml:space="preserve"> respondan correctamente con y sin token.</w:t>
             </w:r>
           </w:p>
         </w:tc>
@@ -2203,7 +2424,23 @@
                 <w:sz w:val="20"/>
                 <w:szCs w:val="20"/>
               </w:rPr>
-              <w:t>02_Backend_Cloud/Investigacion/Fase 2 - Documento Técnico Backend IAM Zero Trust.docx</w:t>
+              <w:t>02_Backend_Cloud/</w:t>
+            </w:r>
+            <w:proofErr w:type="spellStart"/>
+            <w:r>
+              <w:rPr>
+                <w:sz w:val="20"/>
+                <w:szCs w:val="20"/>
+              </w:rPr>
+              <w:t>Investigacion</w:t>
+            </w:r>
+            <w:proofErr w:type="spellEnd"/>
+            <w:r>
+              <w:rPr>
+                <w:sz w:val="20"/>
+                <w:szCs w:val="20"/>
+              </w:rPr>
+              <w:t>/Fase 2 - Documento Técnico Backend IAM Zero Trust.docx</w:t>
             </w:r>
           </w:p>
         </w:tc>
@@ -2231,8 +2468,13 @@
               </w:rPr>
             </w:pPr>
             <w:r>
-              <w:t>Desarrollo de Login</w:t>
-            </w:r>
+              <w:t xml:space="preserve">Desarrollo de </w:t>
+            </w:r>
+            <w:proofErr w:type="spellStart"/>
+            <w:r>
+              <w:t>Login</w:t>
+            </w:r>
+            <w:proofErr w:type="spellEnd"/>
           </w:p>
         </w:tc>
         <w:tc>
@@ -3110,8 +3352,13 @@
               <w:spacing w:after="0"/>
             </w:pPr>
             <w:r>
-              <w:t>Validación de APIs</w:t>
-            </w:r>
+              <w:t xml:space="preserve">Validación de </w:t>
+            </w:r>
+            <w:proofErr w:type="spellStart"/>
+            <w:r>
+              <w:t>APIs</w:t>
+            </w:r>
+            <w:proofErr w:type="spellEnd"/>
           </w:p>
         </w:tc>
         <w:tc>
@@ -3153,8 +3400,13 @@
               <w:spacing w:after="0"/>
             </w:pPr>
             <w:r>
-              <w:t>Google Meet</w:t>
-            </w:r>
+              <w:t xml:space="preserve">Google </w:t>
+            </w:r>
+            <w:proofErr w:type="spellStart"/>
+            <w:r>
+              <w:t>Meet</w:t>
+            </w:r>
+            <w:proofErr w:type="spellEnd"/>
           </w:p>
         </w:tc>
         <w:tc>
@@ -4264,8 +4516,13 @@
               <w:spacing w:after="0"/>
             </w:pPr>
             <w:r>
-              <w:t>Errores de login</w:t>
-            </w:r>
+              <w:t xml:space="preserve">Errores de </w:t>
+            </w:r>
+            <w:proofErr w:type="spellStart"/>
+            <w:r>
+              <w:t>login</w:t>
+            </w:r>
+            <w:proofErr w:type="spellEnd"/>
           </w:p>
         </w:tc>
         <w:tc>
@@ -4706,7 +4963,10 @@
               <w:spacing w:after="0"/>
             </w:pPr>
             <w:r>
-              <w:t>Seguimiento conforme al cronograma</w:t>
+              <w:t xml:space="preserve">Seguimiento </w:t>
+            </w:r>
+            <w:r>
+              <w:t>conforme al cronograma</w:t>
             </w:r>
           </w:p>
         </w:tc>
@@ -4891,8 +5151,13 @@
             <w:pPr>
               <w:spacing w:after="0"/>
             </w:pPr>
-            <w:r>
-              <w:t>Login y control de acceso implementados</w:t>
+            <w:proofErr w:type="spellStart"/>
+            <w:r>
+              <w:t>Login</w:t>
+            </w:r>
+            <w:proofErr w:type="spellEnd"/>
+            <w:r>
+              <w:t xml:space="preserve"> y control de acceso implementados</w:t>
             </w:r>
           </w:p>
         </w:tc>
@@ -5337,7 +5602,10 @@
               <w:spacing w:after="0"/>
             </w:pPr>
             <w:r>
-              <w:t>Implementar controles Zero Trust</w:t>
+              <w:t xml:space="preserve">Implementar </w:t>
+            </w:r>
+            <w:r>
+              <w:t>controles Zero Trust</w:t>
             </w:r>
           </w:p>
         </w:tc>
@@ -5982,13 +6250,31 @@
                 <w:szCs w:val="18"/>
               </w:rPr>
             </w:pPr>
-            <w:r>
-              <w:rPr>
-                <w:sz w:val="18"/>
-                <w:szCs w:val="18"/>
-              </w:rPr>
-              <w:t>Neldy Liliana Hernández Huezo</w:t>
-            </w:r>
+            <w:proofErr w:type="spellStart"/>
+            <w:r>
+              <w:rPr>
+                <w:sz w:val="18"/>
+                <w:szCs w:val="18"/>
+              </w:rPr>
+              <w:t>Neldy</w:t>
+            </w:r>
+            <w:proofErr w:type="spellEnd"/>
+            <w:r>
+              <w:rPr>
+                <w:sz w:val="18"/>
+                <w:szCs w:val="18"/>
+              </w:rPr>
+              <w:t xml:space="preserve"> Liliana Hernández </w:t>
+            </w:r>
+            <w:proofErr w:type="spellStart"/>
+            <w:r>
+              <w:rPr>
+                <w:sz w:val="18"/>
+                <w:szCs w:val="18"/>
+              </w:rPr>
+              <w:t>Huezo</w:t>
+            </w:r>
+            <w:proofErr w:type="spellEnd"/>
           </w:p>
         </w:tc>
         <w:tc>
@@ -6041,7 +6327,14 @@
                 <w:sz w:val="18"/>
                 <w:szCs w:val="18"/>
               </w:rPr>
-              <w:t>Coordinación de reuniones de seguimiento de la Fase 2</w:t>
+              <w:t xml:space="preserve">Coordinación de </w:t>
+            </w:r>
+            <w:r>
+              <w:rPr>
+                <w:sz w:val="18"/>
+                <w:szCs w:val="18"/>
+              </w:rPr>
+              <w:t>reuniones de seguimiento de la Fase 2</w:t>
             </w:r>
           </w:p>
         </w:tc>
@@ -6158,13 +6451,31 @@
                 <w:szCs w:val="18"/>
               </w:rPr>
             </w:pPr>
-            <w:r>
-              <w:rPr>
-                <w:sz w:val="18"/>
-                <w:szCs w:val="18"/>
-              </w:rPr>
-              <w:t>Neldy Liliana Hernández Huezo</w:t>
-            </w:r>
+            <w:proofErr w:type="spellStart"/>
+            <w:r>
+              <w:rPr>
+                <w:sz w:val="18"/>
+                <w:szCs w:val="18"/>
+              </w:rPr>
+              <w:t>Neldy</w:t>
+            </w:r>
+            <w:proofErr w:type="spellEnd"/>
+            <w:r>
+              <w:rPr>
+                <w:sz w:val="18"/>
+                <w:szCs w:val="18"/>
+              </w:rPr>
+              <w:t xml:space="preserve"> Liliana Hernández </w:t>
+            </w:r>
+            <w:proofErr w:type="spellStart"/>
+            <w:r>
+              <w:rPr>
+                <w:sz w:val="18"/>
+                <w:szCs w:val="18"/>
+              </w:rPr>
+              <w:t>Huezo</w:t>
+            </w:r>
+            <w:proofErr w:type="spellEnd"/>
           </w:p>
         </w:tc>
         <w:tc>
@@ -6456,7 +6767,14 @@
                 <w:sz w:val="18"/>
                 <w:szCs w:val="18"/>
               </w:rPr>
-              <w:t>Configuración del proveedor IAM y autenticación de usuarios</w:t>
+              <w:t xml:space="preserve">Configuración del proveedor IAM y </w:t>
+            </w:r>
+            <w:r>
+              <w:rPr>
+                <w:sz w:val="18"/>
+                <w:szCs w:val="18"/>
+              </w:rPr>
+              <w:t>autenticación de usuarios</w:t>
             </w:r>
           </w:p>
         </w:tc>
@@ -7014,14 +7332,7 @@
                 <w:sz w:val="18"/>
                 <w:szCs w:val="18"/>
               </w:rPr>
-              <w:t>Auth0_DataBase</w:t>
-            </w:r>
-            <w:r>
-              <w:rPr>
-                <w:sz w:val="18"/>
-                <w:szCs w:val="18"/>
-              </w:rPr>
-              <w:t>.sql</w:t>
+              <w:t>Auth0_DataBase.sql</w:t>
             </w:r>
           </w:p>
         </w:tc>
@@ -7189,7 +7500,7 @@
                 <w:sz w:val="18"/>
                 <w:szCs w:val="18"/>
               </w:rPr>
-              <w:t>Login_UI.pdf</w:t>
+              <w:t>Fase2_Pantalla_login.docx</w:t>
             </w:r>
           </w:p>
         </w:tc>
@@ -7211,12 +7522,21 @@
                 <w:szCs w:val="18"/>
               </w:rPr>
             </w:pPr>
-            <w:r>
-              <w:rPr>
-                <w:sz w:val="18"/>
-                <w:szCs w:val="18"/>
-              </w:rPr>
-              <w:t>Login desarrollado</w:t>
+            <w:proofErr w:type="spellStart"/>
+            <w:r>
+              <w:rPr>
+                <w:sz w:val="18"/>
+                <w:szCs w:val="18"/>
+              </w:rPr>
+              <w:t>Login</w:t>
+            </w:r>
+            <w:proofErr w:type="spellEnd"/>
+            <w:r>
+              <w:rPr>
+                <w:sz w:val="18"/>
+                <w:szCs w:val="18"/>
+              </w:rPr>
+              <w:t xml:space="preserve"> desarrollado</w:t>
             </w:r>
           </w:p>
         </w:tc>
@@ -7303,6 +7623,174 @@
                 <w:sz w:val="18"/>
                 <w:szCs w:val="18"/>
               </w:rPr>
+              <w:t>Integración Frontend - IAM</w:t>
+            </w:r>
+          </w:p>
+        </w:tc>
+        <w:tc>
+          <w:tcPr>
+            <w:tcW w:w="1800" w:type="dxa"/>
+            <w:tcMar>
+              <w:top w:w="110" w:type="dxa"/>
+              <w:left w:w="90" w:type="dxa"/>
+              <w:bottom w:w="110" w:type="dxa"/>
+              <w:right w:w="90" w:type="dxa"/>
+            </w:tcMar>
+          </w:tcPr>
+          <w:p>
+            <w:pPr>
+              <w:spacing w:after="0"/>
+              <w:rPr>
+                <w:sz w:val="18"/>
+                <w:szCs w:val="18"/>
+              </w:rPr>
+            </w:pPr>
+            <w:r>
+              <w:rPr>
+                <w:sz w:val="18"/>
+                <w:szCs w:val="18"/>
+              </w:rPr>
+              <w:t>Frontend</w:t>
+            </w:r>
+          </w:p>
+        </w:tc>
+        <w:tc>
+          <w:tcPr>
+            <w:tcW w:w="1922" w:type="dxa"/>
+            <w:tcMar>
+              <w:top w:w="110" w:type="dxa"/>
+              <w:left w:w="90" w:type="dxa"/>
+              <w:bottom w:w="110" w:type="dxa"/>
+              <w:right w:w="90" w:type="dxa"/>
+            </w:tcMar>
+          </w:tcPr>
+          <w:p>
+            <w:pPr>
+              <w:spacing w:after="0"/>
+              <w:rPr>
+                <w:sz w:val="18"/>
+                <w:szCs w:val="18"/>
+              </w:rPr>
+            </w:pPr>
+            <w:r>
+              <w:rPr>
+                <w:sz w:val="18"/>
+                <w:szCs w:val="18"/>
+              </w:rPr>
+              <w:t>Fase2_Integración Frontend-IAM.docx</w:t>
+            </w:r>
+          </w:p>
+        </w:tc>
+        <w:tc>
+          <w:tcPr>
+            <w:tcW w:w="1559" w:type="dxa"/>
+            <w:tcMar>
+              <w:top w:w="110" w:type="dxa"/>
+              <w:left w:w="90" w:type="dxa"/>
+              <w:bottom w:w="110" w:type="dxa"/>
+              <w:right w:w="90" w:type="dxa"/>
+            </w:tcMar>
+          </w:tcPr>
+          <w:p>
+            <w:pPr>
+              <w:spacing w:after="0"/>
+              <w:rPr>
+                <w:sz w:val="18"/>
+                <w:szCs w:val="18"/>
+              </w:rPr>
+            </w:pPr>
+            <w:r>
+              <w:rPr>
+                <w:sz w:val="18"/>
+                <w:szCs w:val="18"/>
+              </w:rPr>
+              <w:t>Evidencia Integración.</w:t>
+            </w:r>
+          </w:p>
+        </w:tc>
+      </w:tr>
+      <w:tr>
+        <w:trPr>
+          <w:jc w:val="center"/>
+        </w:trPr>
+        <w:tc>
+          <w:tcPr>
+            <w:tcW w:w="1833" w:type="dxa"/>
+            <w:tcMar>
+              <w:top w:w="110" w:type="dxa"/>
+              <w:left w:w="90" w:type="dxa"/>
+              <w:bottom w:w="110" w:type="dxa"/>
+              <w:right w:w="90" w:type="dxa"/>
+            </w:tcMar>
+          </w:tcPr>
+          <w:p>
+            <w:pPr>
+              <w:spacing w:after="0"/>
+              <w:jc w:val="center"/>
+              <w:rPr>
+                <w:sz w:val="18"/>
+                <w:szCs w:val="18"/>
+              </w:rPr>
+            </w:pPr>
+            <w:r>
+              <w:rPr>
+                <w:sz w:val="18"/>
+                <w:szCs w:val="18"/>
+              </w:rPr>
+              <w:t>Iván Alexander Palacios Hernández</w:t>
+            </w:r>
+          </w:p>
+        </w:tc>
+        <w:tc>
+          <w:tcPr>
+            <w:tcW w:w="1559" w:type="dxa"/>
+            <w:tcMar>
+              <w:top w:w="110" w:type="dxa"/>
+              <w:left w:w="90" w:type="dxa"/>
+              <w:bottom w:w="110" w:type="dxa"/>
+              <w:right w:w="90" w:type="dxa"/>
+            </w:tcMar>
+          </w:tcPr>
+          <w:p>
+            <w:pPr>
+              <w:spacing w:after="0"/>
+              <w:rPr>
+                <w:sz w:val="18"/>
+                <w:szCs w:val="18"/>
+              </w:rPr>
+            </w:pPr>
+            <w:r>
+              <w:rPr>
+                <w:sz w:val="18"/>
+                <w:szCs w:val="18"/>
+              </w:rPr>
+              <w:t>Frontend / Dashboard Jr.</w:t>
+            </w:r>
+          </w:p>
+        </w:tc>
+        <w:tc>
+          <w:tcPr>
+            <w:tcW w:w="2374" w:type="dxa"/>
+            <w:tcMar>
+              <w:top w:w="110" w:type="dxa"/>
+              <w:left w:w="90" w:type="dxa"/>
+              <w:bottom w:w="110" w:type="dxa"/>
+              <w:right w:w="90" w:type="dxa"/>
+            </w:tcMar>
+          </w:tcPr>
+          <w:p>
+            <w:pPr>
+              <w:spacing w:after="0"/>
+              <w:rPr>
+                <w:sz w:val="18"/>
+                <w:szCs w:val="18"/>
+              </w:rPr>
+            </w:pPr>
+            <w:r>
+              <w:rPr>
+                <w:sz w:val="18"/>
+                <w:szCs w:val="18"/>
+              </w:rPr>
               <w:t>Implementación del control de acceso según roles</w:t>
             </w:r>
           </w:p>
@@ -7357,7 +7845,7 @@
                 <w:sz w:val="18"/>
                 <w:szCs w:val="18"/>
               </w:rPr>
-              <w:t>Evidencias_Control_Acceso.pdf</w:t>
+              <w:t>Fase2_Control_Acceso.docx</w:t>
             </w:r>
           </w:p>
         </w:tc>
@@ -7781,7 +8269,46 @@
                 <w:sz w:val="20"/>
                 <w:szCs w:val="20"/>
               </w:rPr>
-              <w:t>Cada fila debe corresponder a un aporte individual atribuible. Ejemplos válidos: commit identificado, sección redactada en un documento, prueba ejecutada, configuración aplicada, endpoint implementado, consulta corregida, vista del dashboard ajustada o script de simulación mejorado.</w:t>
+              <w:t xml:space="preserve">Cada fila debe corresponder a un aporte individual atribuible. Ejemplos válidos: </w:t>
+            </w:r>
+            <w:proofErr w:type="spellStart"/>
+            <w:r>
+              <w:rPr>
+                <w:sz w:val="20"/>
+                <w:szCs w:val="20"/>
+              </w:rPr>
+              <w:t>commit</w:t>
+            </w:r>
+            <w:proofErr w:type="spellEnd"/>
+            <w:r>
+              <w:rPr>
+                <w:sz w:val="20"/>
+                <w:szCs w:val="20"/>
+              </w:rPr>
+              <w:t xml:space="preserve"> identificado, sección redactada en un documento, </w:t>
+            </w:r>
+            <w:r>
+              <w:rPr>
+                <w:sz w:val="20"/>
+                <w:szCs w:val="20"/>
+              </w:rPr>
+              <w:t xml:space="preserve">prueba ejecutada, configuración aplicada, </w:t>
+            </w:r>
+            <w:proofErr w:type="spellStart"/>
+            <w:r>
+              <w:rPr>
+                <w:sz w:val="20"/>
+                <w:szCs w:val="20"/>
+              </w:rPr>
+              <w:t>endpoint</w:t>
+            </w:r>
+            <w:proofErr w:type="spellEnd"/>
+            <w:r>
+              <w:rPr>
+                <w:sz w:val="20"/>
+                <w:szCs w:val="20"/>
+              </w:rPr>
+              <w:t xml:space="preserve"> implementado, consulta corregida, vista del dashboard ajustada o script de simulación mejorado.</w:t>
             </w:r>
           </w:p>
         </w:tc>
@@ -8007,7 +8534,17 @@
                 <w:sz w:val="18"/>
                 <w:szCs w:val="18"/>
               </w:rPr>
-              <w:t>Observación del cumplimiento</w:t>
+              <w:t xml:space="preserve">Observación del </w:t>
+            </w:r>
+            <w:r>
+              <w:rPr>
+                <w:b/>
+                <w:bCs/>
+                <w:color w:val="1F497D"/>
+                <w:sz w:val="18"/>
+                <w:szCs w:val="18"/>
+              </w:rPr>
+              <w:t>cumplimiento</w:t>
             </w:r>
           </w:p>
         </w:tc>
@@ -8184,7 +8721,14 @@
                 <w:sz w:val="18"/>
                 <w:szCs w:val="18"/>
               </w:rPr>
-              <w:t>Coordinar la implementación de auditoría y monitoreo en la Fase 3.</w:t>
+              <w:t xml:space="preserve">Coordinar la implementación de auditoría y </w:t>
+            </w:r>
+            <w:r>
+              <w:rPr>
+                <w:sz w:val="18"/>
+                <w:szCs w:val="18"/>
+              </w:rPr>
+              <w:t>monitoreo en la Fase 3.</w:t>
             </w:r>
           </w:p>
         </w:tc>
@@ -8610,7 +9154,14 @@
                 <w:sz w:val="18"/>
                 <w:szCs w:val="18"/>
               </w:rPr>
-              <w:t>Integrar políticas condicionales de acceso.</w:t>
+              <w:t xml:space="preserve">Integrar </w:t>
+            </w:r>
+            <w:r>
+              <w:rPr>
+                <w:sz w:val="18"/>
+                <w:szCs w:val="18"/>
+              </w:rPr>
+              <w:t>políticas condicionales de acceso.</w:t>
             </w:r>
           </w:p>
         </w:tc>
@@ -8840,7 +9391,14 @@
                 <w:sz w:val="18"/>
                 <w:szCs w:val="18"/>
               </w:rPr>
-              <w:t>Cumplido</w:t>
+              <w:t>Cump</w:t>
+            </w:r>
+            <w:r>
+              <w:rPr>
+                <w:sz w:val="18"/>
+                <w:szCs w:val="18"/>
+              </w:rPr>
+              <w:t>lido</w:t>
             </w:r>
           </w:p>
         </w:tc>
@@ -8954,8 +9512,17 @@
                 <w:sz w:val="18"/>
                 <w:szCs w:val="18"/>
               </w:rPr>
-              <w:t>Desarrollar Login</w:t>
-            </w:r>
+              <w:t xml:space="preserve">Desarrollar </w:t>
+            </w:r>
+            <w:proofErr w:type="spellStart"/>
+            <w:r>
+              <w:rPr>
+                <w:sz w:val="18"/>
+                <w:szCs w:val="18"/>
+              </w:rPr>
+              <w:t>Login</w:t>
+            </w:r>
+            <w:proofErr w:type="spellEnd"/>
           </w:p>
         </w:tc>
         <w:tc>
@@ -9293,7 +9860,14 @@
                 <w:sz w:val="18"/>
                 <w:szCs w:val="18"/>
               </w:rPr>
-              <w:t>Se documentaron escenarios de autenticación y autorización.</w:t>
+              <w:t xml:space="preserve">Se documentaron escenarios de autenticación y </w:t>
+            </w:r>
+            <w:r>
+              <w:rPr>
+                <w:sz w:val="18"/>
+                <w:szCs w:val="18"/>
+              </w:rPr>
+              <w:t>autorización.</w:t>
             </w:r>
           </w:p>
         </w:tc>
@@ -9516,7 +10090,17 @@
                 <w:sz w:val="22"/>
                 <w:szCs w:val="22"/>
               </w:rPr>
-              <w:t>10. Participación en documentos técnicos y entregables</w:t>
+              <w:t>10. Participación en documentos técnicos y ent</w:t>
+            </w:r>
+            <w:r>
+              <w:rPr>
+                <w:b/>
+                <w:bCs/>
+                <w:color w:val="FFFFFF"/>
+                <w:sz w:val="22"/>
+                <w:szCs w:val="22"/>
+              </w:rPr>
+              <w:t>regables</w:t>
             </w:r>
           </w:p>
         </w:tc>
@@ -10459,7 +11043,14 @@
                 <w:sz w:val="18"/>
                 <w:szCs w:val="18"/>
               </w:rPr>
-              <w:t>Ingeniero Cloud / Backend Jr.</w:t>
+              <w:t xml:space="preserve">Ingeniero Cloud / </w:t>
+            </w:r>
+            <w:r>
+              <w:rPr>
+                <w:sz w:val="18"/>
+                <w:szCs w:val="18"/>
+              </w:rPr>
+              <w:t>Backend Jr.</w:t>
             </w:r>
           </w:p>
         </w:tc>
@@ -10622,12 +11213,21 @@
                 <w:szCs w:val="18"/>
               </w:rPr>
             </w:pPr>
-            <w:r>
-              <w:rPr>
-                <w:sz w:val="18"/>
-                <w:szCs w:val="18"/>
-              </w:rPr>
-              <w:t>Login UI</w:t>
+            <w:proofErr w:type="spellStart"/>
+            <w:r>
+              <w:rPr>
+                <w:sz w:val="18"/>
+                <w:szCs w:val="18"/>
+              </w:rPr>
+              <w:t>Login</w:t>
+            </w:r>
+            <w:proofErr w:type="spellEnd"/>
+            <w:r>
+              <w:rPr>
+                <w:sz w:val="18"/>
+                <w:szCs w:val="18"/>
+              </w:rPr>
+              <w:t xml:space="preserve"> UI</w:t>
             </w:r>
           </w:p>
         </w:tc>
@@ -10709,7 +11309,7 @@
                 <w:sz w:val="18"/>
                 <w:szCs w:val="18"/>
               </w:rPr>
-              <w:t>Login_UI.pdf</w:t>
+              <w:t>Fase2_Pantalla_login.docx</w:t>
             </w:r>
           </w:p>
         </w:tc>
@@ -11080,7 +11680,14 @@
                 <w:sz w:val="18"/>
                 <w:szCs w:val="18"/>
               </w:rPr>
-              <w:t>Registro de resultados</w:t>
+              <w:t xml:space="preserve">Registro de </w:t>
+            </w:r>
+            <w:r>
+              <w:rPr>
+                <w:sz w:val="18"/>
+                <w:szCs w:val="18"/>
+              </w:rPr>
+              <w:t>resultados</w:t>
             </w:r>
           </w:p>
         </w:tc>
@@ -11431,7 +12038,17 @@
                 <w:sz w:val="18"/>
                 <w:szCs w:val="18"/>
               </w:rPr>
-              <w:t>Tipo de prueba / configuración</w:t>
+              <w:t xml:space="preserve">Tipo de prueba / </w:t>
+            </w:r>
+            <w:r>
+              <w:rPr>
+                <w:b/>
+                <w:bCs/>
+                <w:color w:val="1F497D"/>
+                <w:sz w:val="18"/>
+                <w:szCs w:val="18"/>
+              </w:rPr>
+              <w:t>configuración</w:t>
             </w:r>
           </w:p>
         </w:tc>
@@ -11564,12 +12181,21 @@
                 <w:szCs w:val="18"/>
               </w:rPr>
             </w:pPr>
-            <w:r>
-              <w:rPr>
-                <w:sz w:val="18"/>
-                <w:szCs w:val="18"/>
-              </w:rPr>
-              <w:t>Neldy Liliana Hernández</w:t>
+            <w:proofErr w:type="spellStart"/>
+            <w:r>
+              <w:rPr>
+                <w:sz w:val="18"/>
+                <w:szCs w:val="18"/>
+              </w:rPr>
+              <w:t>Neldy</w:t>
+            </w:r>
+            <w:proofErr w:type="spellEnd"/>
+            <w:r>
+              <w:rPr>
+                <w:sz w:val="18"/>
+                <w:szCs w:val="18"/>
+              </w:rPr>
+              <w:t xml:space="preserve"> Liliana Hernández</w:t>
             </w:r>
           </w:p>
         </w:tc>
@@ -11792,7 +12418,14 @@
                 <w:sz w:val="18"/>
                 <w:szCs w:val="18"/>
               </w:rPr>
-              <w:t>Servicio configurado correctamente</w:t>
+              <w:t xml:space="preserve">Servicio configurado </w:t>
+            </w:r>
+            <w:r>
+              <w:rPr>
+                <w:sz w:val="18"/>
+                <w:szCs w:val="18"/>
+              </w:rPr>
+              <w:t>correctamente</w:t>
             </w:r>
           </w:p>
         </w:tc>
@@ -12324,6 +12957,7 @@
                 <w:szCs w:val="18"/>
               </w:rPr>
             </w:pPr>
+            <w:proofErr w:type="spellStart"/>
             <w:r>
               <w:rPr>
                 <w:sz w:val="18"/>
@@ -12331,6 +12965,7 @@
               </w:rPr>
               <w:t>Login</w:t>
             </w:r>
+            <w:proofErr w:type="spellEnd"/>
           </w:p>
         </w:tc>
         <w:tc>
@@ -12383,7 +13018,7 @@
                 <w:sz w:val="18"/>
                 <w:szCs w:val="18"/>
               </w:rPr>
-              <w:t>Login_UI.pdf</w:t>
+              <w:t>Fase2_Pantalla_login.docx</w:t>
             </w:r>
           </w:p>
         </w:tc>
@@ -12443,6 +13078,161 @@
                 <w:sz w:val="18"/>
                 <w:szCs w:val="18"/>
               </w:rPr>
+              <w:t>Validación Frontend</w:t>
+            </w:r>
+          </w:p>
+        </w:tc>
+        <w:tc>
+          <w:tcPr>
+            <w:tcW w:w="1701" w:type="dxa"/>
+            <w:tcMar>
+              <w:top w:w="110" w:type="dxa"/>
+              <w:left w:w="90" w:type="dxa"/>
+              <w:bottom w:w="110" w:type="dxa"/>
+              <w:right w:w="90" w:type="dxa"/>
+            </w:tcMar>
+          </w:tcPr>
+          <w:p>
+            <w:pPr>
+              <w:spacing w:after="0"/>
+              <w:rPr>
+                <w:sz w:val="18"/>
+                <w:szCs w:val="18"/>
+              </w:rPr>
+            </w:pPr>
+            <w:r>
+              <w:rPr>
+                <w:sz w:val="18"/>
+                <w:szCs w:val="18"/>
+              </w:rPr>
+              <w:t>Integración IAM</w:t>
+            </w:r>
+          </w:p>
+        </w:tc>
+        <w:tc>
+          <w:tcPr>
+            <w:tcW w:w="1984" w:type="dxa"/>
+            <w:tcMar>
+              <w:top w:w="110" w:type="dxa"/>
+              <w:left w:w="90" w:type="dxa"/>
+              <w:bottom w:w="110" w:type="dxa"/>
+              <w:right w:w="90" w:type="dxa"/>
+            </w:tcMar>
+          </w:tcPr>
+          <w:p>
+            <w:pPr>
+              <w:spacing w:after="0"/>
+              <w:rPr>
+                <w:sz w:val="18"/>
+                <w:szCs w:val="18"/>
+              </w:rPr>
+            </w:pPr>
+            <w:r>
+              <w:rPr>
+                <w:sz w:val="18"/>
+                <w:szCs w:val="18"/>
+              </w:rPr>
+              <w:t>Evidencias</w:t>
+            </w:r>
+          </w:p>
+        </w:tc>
+        <w:tc>
+          <w:tcPr>
+            <w:tcW w:w="2552" w:type="dxa"/>
+            <w:tcMar>
+              <w:top w:w="110" w:type="dxa"/>
+              <w:left w:w="90" w:type="dxa"/>
+              <w:bottom w:w="110" w:type="dxa"/>
+              <w:right w:w="90" w:type="dxa"/>
+            </w:tcMar>
+          </w:tcPr>
+          <w:p>
+            <w:pPr>
+              <w:spacing w:after="0"/>
+              <w:rPr>
+                <w:sz w:val="18"/>
+                <w:szCs w:val="18"/>
+              </w:rPr>
+            </w:pPr>
+            <w:r>
+              <w:rPr>
+                <w:sz w:val="18"/>
+                <w:szCs w:val="18"/>
+              </w:rPr>
+              <w:t>Fase2_Integración Frontend-IAM</w:t>
+            </w:r>
+            <w:r>
+              <w:rPr>
+                <w:sz w:val="18"/>
+                <w:szCs w:val="18"/>
+              </w:rPr>
+              <w:t>.docx</w:t>
+            </w:r>
+          </w:p>
+        </w:tc>
+      </w:tr>
+      <w:tr>
+        <w:trPr>
+          <w:jc w:val="center"/>
+        </w:trPr>
+        <w:tc>
+          <w:tcPr>
+            <w:tcW w:w="2117" w:type="dxa"/>
+            <w:tcMar>
+              <w:top w:w="110" w:type="dxa"/>
+              <w:left w:w="90" w:type="dxa"/>
+              <w:bottom w:w="110" w:type="dxa"/>
+              <w:right w:w="90" w:type="dxa"/>
+            </w:tcMar>
+          </w:tcPr>
+          <w:p>
+            <w:pPr>
+              <w:spacing w:after="0"/>
+              <w:jc w:val="center"/>
+              <w:rPr>
+                <w:sz w:val="18"/>
+                <w:szCs w:val="18"/>
+              </w:rPr>
+            </w:pPr>
+            <w:r>
+              <w:rPr>
+                <w:sz w:val="18"/>
+                <w:szCs w:val="18"/>
+              </w:rPr>
+              <w:t xml:space="preserve">Iván Alexander </w:t>
+            </w:r>
+            <w:r>
+              <w:rPr>
+                <w:sz w:val="18"/>
+                <w:szCs w:val="18"/>
+              </w:rPr>
+              <w:t>Palacios Hernández</w:t>
+            </w:r>
+          </w:p>
+        </w:tc>
+        <w:tc>
+          <w:tcPr>
+            <w:tcW w:w="2268" w:type="dxa"/>
+            <w:tcMar>
+              <w:top w:w="110" w:type="dxa"/>
+              <w:left w:w="90" w:type="dxa"/>
+              <w:bottom w:w="110" w:type="dxa"/>
+              <w:right w:w="90" w:type="dxa"/>
+            </w:tcMar>
+          </w:tcPr>
+          <w:p>
+            <w:pPr>
+              <w:spacing w:after="0"/>
+              <w:rPr>
+                <w:sz w:val="18"/>
+                <w:szCs w:val="18"/>
+              </w:rPr>
+            </w:pPr>
+            <w:r>
+              <w:rPr>
+                <w:sz w:val="18"/>
+                <w:szCs w:val="18"/>
+              </w:rPr>
               <w:t>Validación Control de Acceso</w:t>
             </w:r>
           </w:p>
@@ -12524,7 +13314,7 @@
                 <w:sz w:val="18"/>
                 <w:szCs w:val="18"/>
               </w:rPr>
-              <w:t>Evidencias_Control_Acceso.pdf</w:t>
+              <w:t>Fase2_Control_Acceso.docx</w:t>
             </w:r>
           </w:p>
         </w:tc>
@@ -13581,6 +14371,7 @@
                 <w:sz w:val="22"/>
                 <w:szCs w:val="22"/>
               </w:rPr>
+              <w:lastRenderedPageBreak/>
               <w:t>13. Reflexión individual por rol</w:t>
             </w:r>
           </w:p>
@@ -13649,7 +14440,6 @@
                 <w:sz w:val="18"/>
                 <w:szCs w:val="18"/>
               </w:rPr>
-              <w:lastRenderedPageBreak/>
               <w:t>Integrante</w:t>
             </w:r>
           </w:p>
@@ -13853,13 +14643,31 @@
                 <w:szCs w:val="18"/>
               </w:rPr>
             </w:pPr>
-            <w:r>
-              <w:rPr>
-                <w:sz w:val="18"/>
-                <w:szCs w:val="18"/>
-              </w:rPr>
-              <w:t>Neldy Liliana Hernández Huezo</w:t>
-            </w:r>
+            <w:proofErr w:type="spellStart"/>
+            <w:r>
+              <w:rPr>
+                <w:sz w:val="18"/>
+                <w:szCs w:val="18"/>
+              </w:rPr>
+              <w:t>Neldy</w:t>
+            </w:r>
+            <w:proofErr w:type="spellEnd"/>
+            <w:r>
+              <w:rPr>
+                <w:sz w:val="18"/>
+                <w:szCs w:val="18"/>
+              </w:rPr>
+              <w:t xml:space="preserve"> Liliana Hernández </w:t>
+            </w:r>
+            <w:proofErr w:type="spellStart"/>
+            <w:r>
+              <w:rPr>
+                <w:sz w:val="18"/>
+                <w:szCs w:val="18"/>
+              </w:rPr>
+              <w:t>Huezo</w:t>
+            </w:r>
+            <w:proofErr w:type="spellEnd"/>
           </w:p>
         </w:tc>
         <w:tc>
@@ -14134,7 +14942,14 @@
                 <w:sz w:val="18"/>
                 <w:szCs w:val="18"/>
               </w:rPr>
-              <w:t>Se revisó la documentación oficial y se realizaron pruebas de autenticación.</w:t>
+              <w:t xml:space="preserve">Se revisó la documentación oficial y se </w:t>
+            </w:r>
+            <w:r>
+              <w:rPr>
+                <w:sz w:val="18"/>
+                <w:szCs w:val="18"/>
+              </w:rPr>
+              <w:t>realizaron pruebas de autenticación.</w:t>
             </w:r>
           </w:p>
         </w:tc>
@@ -14302,7 +15117,14 @@
                 <w:sz w:val="18"/>
                 <w:szCs w:val="18"/>
               </w:rPr>
-              <w:t>Se validaron los servicios y el flujo de autenticación.</w:t>
+              <w:t>Se validaron l</w:t>
+            </w:r>
+            <w:r>
+              <w:rPr>
+                <w:sz w:val="18"/>
+                <w:szCs w:val="18"/>
+              </w:rPr>
+              <w:t>os servicios y el flujo de autenticación.</w:t>
             </w:r>
           </w:p>
         </w:tc>
@@ -14470,7 +15292,14 @@
                 <w:sz w:val="18"/>
                 <w:szCs w:val="18"/>
               </w:rPr>
-              <w:t>Se realizaron pruebas de comunicación y validación de sesiones.</w:t>
+              <w:t xml:space="preserve">Se </w:t>
+            </w:r>
+            <w:r>
+              <w:rPr>
+                <w:sz w:val="18"/>
+                <w:szCs w:val="18"/>
+              </w:rPr>
+              <w:t>realizaron pruebas de comunicación y validación de sesiones.</w:t>
             </w:r>
           </w:p>
         </w:tc>
@@ -14611,7 +15440,14 @@
                 <w:sz w:val="18"/>
                 <w:szCs w:val="18"/>
               </w:rPr>
-              <w:t>Definición de escenarios de prueba.</w:t>
+              <w:t>Definición de escenarios de prueba</w:t>
+            </w:r>
+            <w:r>
+              <w:rPr>
+                <w:sz w:val="18"/>
+                <w:szCs w:val="18"/>
+              </w:rPr>
+              <w:t>.</w:t>
             </w:r>
           </w:p>
         </w:tc>
@@ -14986,7 +15822,14 @@
                 <w:sz w:val="18"/>
                 <w:szCs w:val="18"/>
               </w:rPr>
-              <w:t>Acta de reunión de seguimiento Fase 2</w:t>
+              <w:t xml:space="preserve">Acta de reunión de </w:t>
+            </w:r>
+            <w:r>
+              <w:rPr>
+                <w:sz w:val="18"/>
+                <w:szCs w:val="18"/>
+              </w:rPr>
+              <w:t>seguimiento Fase 2</w:t>
             </w:r>
           </w:p>
         </w:tc>
@@ -15070,7 +15913,16 @@
                   <w:szCs w:val="18"/>
                   <w:u w:val="single"/>
                 </w:rPr>
-                <w:t>https://github.com/neldylilianahernandez23-collab/IAM-ZeroTrust-SN6/blob/dc875c4dcd9b1f039a96f9e083e22f594c04cc71/00_Gestion_Proyecto/Actas_Reunion/Acta_Reunion_003_Fase2_SN6.docx</w:t>
+                <w:t>https://github.com/neldylilianahernandez23-collab/IAM-ZeroT</w:t>
+              </w:r>
+              <w:r>
+                <w:rPr>
+                  <w:color w:val="0000FF"/>
+                  <w:sz w:val="18"/>
+                  <w:szCs w:val="18"/>
+                  <w:u w:val="single"/>
+                </w:rPr>
+                <w:t>rust-SN6/blob/dc875c4dcd9b1f039a96f9e083e22f594c04cc71/00_Gestion_Proyecto/Actas_Reunion/Acta_Reunion_003_Fase2_SN6.docx</w:t>
               </w:r>
             </w:hyperlink>
           </w:p>
@@ -15113,6 +15965,7 @@
                 <w:sz w:val="18"/>
                 <w:szCs w:val="18"/>
               </w:rPr>
+              <w:lastRenderedPageBreak/>
               <w:t>2</w:t>
             </w:r>
           </w:p>
@@ -15365,7 +16218,7 @@
                   <w:szCs w:val="18"/>
                   <w:u w:val="single"/>
                 </w:rPr>
-                <w:t>https://github.com/neldylilianahernandez23-collab/IAM-</w:t>
+                <w:t>https://github.com/neldylilianahernandez23-collab/IAM-ZeroTrust-SN6/blob/c4969a2bf548d327c0eec84f41f81e987f8e1db6/00_Gestion_Proyecto/Cronogramas/Cronograma%20de%20activid</w:t>
               </w:r>
               <w:r>
                 <w:rPr>
@@ -15374,8 +16227,7 @@
                   <w:szCs w:val="18"/>
                   <w:u w:val="single"/>
                 </w:rPr>
-                <w:lastRenderedPageBreak/>
-                <w:t>ZeroTrust-SN6/blob/c4969a2bf548d327c0eec84f41f81e987f8e1db6/00_Gestion_Proyecto/Cronogramas/Cronograma%20de%20actividades%20%20Fase%202%20%E2%80%93%20Implementaci%C3%B3n%20del%20n%C3%BAcleo%20IAM%20y%20pol%C3%ADticas%20de%20acceso.xlsx</w:t>
+                <w:t>ades%20%20Fase%202%20%E2%80%93%20Implementaci%C3%B3n%20del%20n%C3%BAcleo%20IAM%20y%20pol%C3%ADticas%20de%20acceso.xlsx</w:t>
               </w:r>
             </w:hyperlink>
           </w:p>
@@ -15418,7 +16270,6 @@
                 <w:sz w:val="18"/>
                 <w:szCs w:val="18"/>
               </w:rPr>
-              <w:lastRenderedPageBreak/>
               <w:t>4</w:t>
             </w:r>
           </w:p>
@@ -15714,7 +16565,14 @@
                 <w:sz w:val="18"/>
                 <w:szCs w:val="18"/>
               </w:rPr>
-              <w:t>Integración Backend–IAM</w:t>
+              <w:t xml:space="preserve">Integración </w:t>
+            </w:r>
+            <w:r>
+              <w:rPr>
+                <w:sz w:val="18"/>
+                <w:szCs w:val="18"/>
+              </w:rPr>
+              <w:t>Backend–IAM</w:t>
             </w:r>
           </w:p>
         </w:tc>
@@ -15983,8 +16841,17 @@
                 <w:sz w:val="18"/>
                 <w:szCs w:val="18"/>
               </w:rPr>
-              <w:t>Interfaz de Login</w:t>
-            </w:r>
+              <w:t xml:space="preserve">Interfaz de </w:t>
+            </w:r>
+            <w:proofErr w:type="spellStart"/>
+            <w:r>
+              <w:rPr>
+                <w:sz w:val="18"/>
+                <w:szCs w:val="18"/>
+              </w:rPr>
+              <w:t>Login</w:t>
+            </w:r>
+            <w:proofErr w:type="spellEnd"/>
           </w:p>
         </w:tc>
         <w:tc>
@@ -16060,6 +16927,16 @@
                 <w:szCs w:val="18"/>
               </w:rPr>
             </w:pPr>
+            <w:hyperlink r:id="rId10" w:history="1">
+              <w:r>
+                <w:rPr>
+                  <w:rStyle w:val="Hipervnculo"/>
+                  <w:sz w:val="18"/>
+                  <w:szCs w:val="18"/>
+                </w:rPr>
+                <w:t>https://github.com/neldylilianahernandez23-collab/IAM-ZeroTrust-SN6/blob/main/03_Frontend_Dashboard/Investigacion/Fase2_Pantalla_login.docx</w:t>
+              </w:r>
+            </w:hyperlink>
           </w:p>
         </w:tc>
       </w:tr>
@@ -16113,12 +16990,21 @@
                 <w:szCs w:val="18"/>
               </w:rPr>
             </w:pPr>
-            <w:r>
-              <w:rPr>
-                <w:sz w:val="18"/>
-                <w:szCs w:val="18"/>
-              </w:rPr>
-              <w:t>Evidencias de Control de Acceso</w:t>
+            <w:proofErr w:type="spellStart"/>
+            <w:r>
+              <w:rPr>
+                <w:sz w:val="18"/>
+                <w:szCs w:val="18"/>
+              </w:rPr>
+              <w:t>Integracion</w:t>
+            </w:r>
+            <w:proofErr w:type="spellEnd"/>
+            <w:r>
+              <w:rPr>
+                <w:sz w:val="18"/>
+                <w:szCs w:val="18"/>
+              </w:rPr>
+              <w:t xml:space="preserve"> IAM</w:t>
             </w:r>
           </w:p>
         </w:tc>
@@ -16195,6 +17081,16 @@
                 <w:szCs w:val="18"/>
               </w:rPr>
             </w:pPr>
+            <w:hyperlink r:id="rId11" w:history="1">
+              <w:r>
+                <w:rPr>
+                  <w:rStyle w:val="Hipervnculo"/>
+                  <w:sz w:val="18"/>
+                  <w:szCs w:val="18"/>
+                </w:rPr>
+                <w:t>https://github.com/neldylilianahernandez23-collab/IAM-ZeroTrust-SN6/blob/main/03_Frontend_Dashboard/Investigacion/Fase2_Integraci%C3%B3n%20Frontend-IAM.docx</w:t>
+              </w:r>
+            </w:hyperlink>
           </w:p>
         </w:tc>
       </w:tr>
@@ -16242,17 +17138,18 @@
           </w:tcPr>
           <w:p>
             <w:pPr>
-              <w:rPr>
-                <w:sz w:val="18"/>
-                <w:szCs w:val="18"/>
-              </w:rPr>
-            </w:pPr>
-            <w:r>
-              <w:rPr>
-                <w:sz w:val="18"/>
-                <w:szCs w:val="18"/>
-              </w:rPr>
-              <w:t>Casos de Prueba</w:t>
+              <w:spacing w:after="0"/>
+              <w:rPr>
+                <w:sz w:val="18"/>
+                <w:szCs w:val="18"/>
+              </w:rPr>
+            </w:pPr>
+            <w:r>
+              <w:rPr>
+                <w:sz w:val="18"/>
+                <w:szCs w:val="18"/>
+              </w:rPr>
+              <w:t>Evidencias de Control de Acceso</w:t>
             </w:r>
           </w:p>
         </w:tc>
@@ -16280,7 +17177,7 @@
                 <w:sz w:val="18"/>
                 <w:szCs w:val="18"/>
               </w:rPr>
-              <w:t>Excel</w:t>
+              <w:t>Documento</w:t>
             </w:r>
           </w:p>
         </w:tc>
@@ -16307,7 +17204,7 @@
                 <w:sz w:val="18"/>
                 <w:szCs w:val="18"/>
               </w:rPr>
-              <w:t>QA / Seguridad / Documentación Jr.</w:t>
+              <w:t>Frontend / Dashboard Jr.</w:t>
             </w:r>
           </w:p>
         </w:tc>
@@ -16329,6 +17226,16 @@
                 <w:szCs w:val="18"/>
               </w:rPr>
             </w:pPr>
+            <w:hyperlink r:id="rId12" w:history="1">
+              <w:r>
+                <w:rPr>
+                  <w:rStyle w:val="Hipervnculo"/>
+                  <w:sz w:val="18"/>
+                  <w:szCs w:val="18"/>
+                </w:rPr>
+                <w:t>https://github.com/neldylilianahernandez23-collab/IAM-ZeroTrust-SN6/blob/main/03_Frontend_Dashboard/Investigacion/Fase2_Control_Acceso.docx</w:t>
+              </w:r>
+            </w:hyperlink>
           </w:p>
         </w:tc>
       </w:tr>
@@ -16360,7 +17267,163 @@
                 <w:sz w:val="18"/>
                 <w:szCs w:val="18"/>
               </w:rPr>
-              <w:t>11</w:t>
+              <w:lastRenderedPageBreak/>
+              <w:t>1</w:t>
+            </w:r>
+            <w:r>
+              <w:rPr>
+                <w:sz w:val="18"/>
+                <w:szCs w:val="18"/>
+              </w:rPr>
+              <w:t>1</w:t>
+            </w:r>
+          </w:p>
+        </w:tc>
+        <w:tc>
+          <w:tcPr>
+            <w:tcW w:w="3170" w:type="dxa"/>
+            <w:tcMar>
+              <w:top w:w="110" w:type="dxa"/>
+              <w:left w:w="90" w:type="dxa"/>
+              <w:bottom w:w="110" w:type="dxa"/>
+              <w:right w:w="90" w:type="dxa"/>
+            </w:tcMar>
+          </w:tcPr>
+          <w:p>
+            <w:pPr>
+              <w:rPr>
+                <w:sz w:val="18"/>
+                <w:szCs w:val="18"/>
+              </w:rPr>
+            </w:pPr>
+            <w:r>
+              <w:rPr>
+                <w:sz w:val="18"/>
+                <w:szCs w:val="18"/>
+              </w:rPr>
+              <w:t xml:space="preserve">Casos de </w:t>
+            </w:r>
+            <w:r>
+              <w:rPr>
+                <w:sz w:val="18"/>
+                <w:szCs w:val="18"/>
+              </w:rPr>
+              <w:t>Prueba</w:t>
+            </w:r>
+          </w:p>
+        </w:tc>
+        <w:tc>
+          <w:tcPr>
+            <w:tcW w:w="1417" w:type="dxa"/>
+            <w:tcMar>
+              <w:top w:w="110" w:type="dxa"/>
+              <w:left w:w="90" w:type="dxa"/>
+              <w:bottom w:w="110" w:type="dxa"/>
+              <w:right w:w="90" w:type="dxa"/>
+            </w:tcMar>
+          </w:tcPr>
+          <w:p>
+            <w:pPr>
+              <w:spacing w:after="0"/>
+              <w:jc w:val="center"/>
+              <w:rPr>
+                <w:sz w:val="18"/>
+                <w:szCs w:val="18"/>
+              </w:rPr>
+            </w:pPr>
+            <w:r>
+              <w:rPr>
+                <w:sz w:val="18"/>
+                <w:szCs w:val="18"/>
+              </w:rPr>
+              <w:t>Excel</w:t>
+            </w:r>
+          </w:p>
+        </w:tc>
+        <w:tc>
+          <w:tcPr>
+            <w:tcW w:w="1965" w:type="dxa"/>
+            <w:tcMar>
+              <w:top w:w="110" w:type="dxa"/>
+              <w:left w:w="90" w:type="dxa"/>
+              <w:bottom w:w="110" w:type="dxa"/>
+              <w:right w:w="90" w:type="dxa"/>
+            </w:tcMar>
+          </w:tcPr>
+          <w:p>
+            <w:pPr>
+              <w:spacing w:after="0"/>
+              <w:rPr>
+                <w:sz w:val="18"/>
+                <w:szCs w:val="18"/>
+              </w:rPr>
+            </w:pPr>
+            <w:r>
+              <w:rPr>
+                <w:sz w:val="18"/>
+                <w:szCs w:val="18"/>
+              </w:rPr>
+              <w:t>QA / Seguridad / Documentación Jr.</w:t>
+            </w:r>
+          </w:p>
+        </w:tc>
+        <w:tc>
+          <w:tcPr>
+            <w:tcW w:w="2736" w:type="dxa"/>
+            <w:tcMar>
+              <w:top w:w="110" w:type="dxa"/>
+              <w:left w:w="90" w:type="dxa"/>
+              <w:bottom w:w="110" w:type="dxa"/>
+              <w:right w:w="90" w:type="dxa"/>
+            </w:tcMar>
+          </w:tcPr>
+          <w:p>
+            <w:pPr>
+              <w:spacing w:after="0"/>
+              <w:rPr>
+                <w:sz w:val="18"/>
+                <w:szCs w:val="18"/>
+              </w:rPr>
+            </w:pPr>
+          </w:p>
+        </w:tc>
+      </w:tr>
+      <w:tr>
+        <w:trPr>
+          <w:jc w:val="center"/>
+        </w:trPr>
+        <w:tc>
+          <w:tcPr>
+            <w:tcW w:w="648" w:type="dxa"/>
+            <w:tcMar>
+              <w:top w:w="110" w:type="dxa"/>
+              <w:left w:w="90" w:type="dxa"/>
+              <w:bottom w:w="110" w:type="dxa"/>
+              <w:right w:w="90" w:type="dxa"/>
+            </w:tcMar>
+          </w:tcPr>
+          <w:p>
+            <w:pPr>
+              <w:spacing w:after="0"/>
+              <w:jc w:val="center"/>
+              <w:rPr>
+                <w:sz w:val="18"/>
+                <w:szCs w:val="18"/>
+              </w:rPr>
+            </w:pPr>
+            <w:r>
+              <w:rPr>
+                <w:sz w:val="18"/>
+                <w:szCs w:val="18"/>
+              </w:rPr>
+              <w:t>1</w:t>
+            </w:r>
+            <w:r>
+              <w:rPr>
+                <w:sz w:val="18"/>
+                <w:szCs w:val="18"/>
+              </w:rPr>
+              <w:t>2</w:t>
             </w:r>
           </w:p>
         </w:tc>
@@ -16523,7 +17586,30 @@
                 <w:sz w:val="20"/>
                 <w:szCs w:val="20"/>
               </w:rPr>
-              <w:t>La evidencia debe permitir verificar el aporte sin ambigüedad. Se recomienda incluir identificadores concretos: URL, commit hash, nombre de archivo, ruta de carpeta, nombre de prueba, nombre de servicio, fecha y referencia del estudiante responsable.</w:t>
+              <w:t xml:space="preserve">La evidencia debe permitir verificar el aporte sin ambigüedad. Se recomienda incluir </w:t>
+            </w:r>
+            <w:r>
+              <w:rPr>
+                <w:sz w:val="20"/>
+                <w:szCs w:val="20"/>
+              </w:rPr>
+              <w:t xml:space="preserve">identificadores concretos: URL, </w:t>
+            </w:r>
+            <w:proofErr w:type="spellStart"/>
+            <w:r>
+              <w:rPr>
+                <w:sz w:val="20"/>
+                <w:szCs w:val="20"/>
+              </w:rPr>
+              <w:t>commit</w:t>
+            </w:r>
+            <w:proofErr w:type="spellEnd"/>
+            <w:r>
+              <w:rPr>
+                <w:sz w:val="20"/>
+                <w:szCs w:val="20"/>
+              </w:rPr>
+              <w:t xml:space="preserve"> hash, nombre de archivo, ruta de carpeta, nombre de prueba, nombre de servicio, fecha y referencia del estudiante responsable.</w:t>
             </w:r>
           </w:p>
         </w:tc>
@@ -16588,11 +17674,10 @@
         <w:t>Semana 3 correspondiente a la Fase 2</w:t>
       </w:r>
       <w:r>
-        <w:t xml:space="preserve"> se recopilaron evidencias relacionadas con la implementación del proveedor de identidad (IAM), la configuración de autenticación de usuarios, la integración entre el Backend y el servicio IAM, el desarrollo de la interfaz de inicio de sesión, la implementación del control </w:t>
+        <w:t xml:space="preserve"> se recopilaron evidencias relacionadas con la implementación del proveedor de identidad (IAM), la configuración de autenticación de usuarios, la integración entre el Backend y el servicio IAM, el desarrollo de la interfaz de inicio de sesión, la implement</w:t>
       </w:r>
       <w:r>
-        <w:lastRenderedPageBreak/>
-        <w:t xml:space="preserve">de acceso basado en roles, la ejecución de pruebas funcionales y la consolidación del entregable técnico de la fase. </w:t>
+        <w:t xml:space="preserve">ación del control de acceso basado en roles, la ejecución de pruebas funcionales y la consolidación del entregable técnico de la fase. </w:t>
       </w:r>
     </w:p>
     <w:p>
@@ -16647,7 +17732,14 @@
           <w:sz w:val="22"/>
           <w:szCs w:val="22"/>
         </w:rPr>
-        <w:t xml:space="preserve"> 00_Gestion_Proyecto/Documentos/Documento_Fase2_SN6.docx</w:t>
+        <w:t xml:space="preserve"> 00_Gestion_Proyecto/Documen</w:t>
+      </w:r>
+      <w:r>
+        <w:rPr>
+          <w:sz w:val="22"/>
+          <w:szCs w:val="22"/>
+        </w:rPr>
+        <w:t>tos/Documento_Fase2_SN6.docx</w:t>
       </w:r>
     </w:p>
     <w:p>
@@ -16697,7 +17789,23 @@
           <w:sz w:val="22"/>
           <w:szCs w:val="22"/>
         </w:rPr>
-        <w:t xml:space="preserve"> 01_IAM/Implementacion/Configuracion_IAM.docx</w:t>
+        <w:t xml:space="preserve"> 01_IAM/</w:t>
+      </w:r>
+      <w:proofErr w:type="spellStart"/>
+      <w:r>
+        <w:rPr>
+          <w:sz w:val="22"/>
+          <w:szCs w:val="22"/>
+        </w:rPr>
+        <w:t>Implementacion</w:t>
+      </w:r>
+      <w:proofErr w:type="spellEnd"/>
+      <w:r>
+        <w:rPr>
+          <w:sz w:val="22"/>
+          <w:szCs w:val="22"/>
+        </w:rPr>
+        <w:t>/Configuracion_IAM.docx</w:t>
       </w:r>
     </w:p>
     <w:p>
@@ -16722,7 +17830,30 @@
           <w:sz w:val="22"/>
           <w:szCs w:val="22"/>
         </w:rPr>
-        <w:t xml:space="preserve"> 01_IAM/Implementacion/Politicas_Acceso_IAM.docx</w:t>
+        <w:t xml:space="preserve"> 01_IAM/</w:t>
+      </w:r>
+      <w:proofErr w:type="spellStart"/>
+      <w:r>
+        <w:rPr>
+          <w:sz w:val="22"/>
+          <w:szCs w:val="22"/>
+        </w:rPr>
+        <w:t>Implement</w:t>
+      </w:r>
+      <w:r>
+        <w:rPr>
+          <w:sz w:val="22"/>
+          <w:szCs w:val="22"/>
+        </w:rPr>
+        <w:t>acion</w:t>
+      </w:r>
+      <w:proofErr w:type="spellEnd"/>
+      <w:r>
+        <w:rPr>
+          <w:sz w:val="22"/>
+          <w:szCs w:val="22"/>
+        </w:rPr>
+        <w:t>/Politicas_Acceso_IAM.docx</w:t>
       </w:r>
     </w:p>
     <w:p>
@@ -16734,6 +17865,7 @@
           <w:lang w:val="en-US"/>
         </w:rPr>
       </w:pPr>
+      <w:proofErr w:type="spellStart"/>
       <w:r>
         <w:rPr>
           <w:b/>
@@ -16742,7 +17874,18 @@
           <w:szCs w:val="22"/>
           <w:lang w:val="en-US"/>
         </w:rPr>
-        <w:t>Evidencia 6:</w:t>
+        <w:t>Evidencia</w:t>
+      </w:r>
+      <w:proofErr w:type="spellEnd"/>
+      <w:r>
+        <w:rPr>
+          <w:b/>
+          <w:bCs/>
+          <w:sz w:val="22"/>
+          <w:szCs w:val="22"/>
+          <w:lang w:val="en-US"/>
+        </w:rPr>
+        <w:t xml:space="preserve"> 6:</w:t>
       </w:r>
       <w:r>
         <w:rPr>
@@ -16775,7 +17918,23 @@
           <w:sz w:val="22"/>
           <w:szCs w:val="22"/>
         </w:rPr>
-        <w:t xml:space="preserve"> 02_Backend_Cloud/BaseDatos/Modelo_Datos_IAM.docx</w:t>
+        <w:t xml:space="preserve"> 02_Backend_Cloud/</w:t>
+      </w:r>
+      <w:proofErr w:type="spellStart"/>
+      <w:r>
+        <w:rPr>
+          <w:sz w:val="22"/>
+          <w:szCs w:val="22"/>
+        </w:rPr>
+        <w:t>BaseDatos</w:t>
+      </w:r>
+      <w:proofErr w:type="spellEnd"/>
+      <w:r>
+        <w:rPr>
+          <w:sz w:val="22"/>
+          <w:szCs w:val="22"/>
+        </w:rPr>
+        <w:t>/Modelo_Datos_IAM.docx</w:t>
       </w:r>
     </w:p>
     <w:p>
@@ -16787,6 +17946,7 @@
           <w:lang w:val="en-US"/>
         </w:rPr>
       </w:pPr>
+      <w:proofErr w:type="spellStart"/>
       <w:r>
         <w:rPr>
           <w:b/>
@@ -16795,7 +17955,18 @@
           <w:szCs w:val="22"/>
           <w:lang w:val="en-US"/>
         </w:rPr>
-        <w:t>Evidencia 8:</w:t>
+        <w:t>Evidencia</w:t>
+      </w:r>
+      <w:proofErr w:type="spellEnd"/>
+      <w:r>
+        <w:rPr>
+          <w:b/>
+          <w:bCs/>
+          <w:sz w:val="22"/>
+          <w:szCs w:val="22"/>
+          <w:lang w:val="en-US"/>
+        </w:rPr>
+        <w:t xml:space="preserve"> 8:</w:t>
       </w:r>
       <w:r>
         <w:rPr>
@@ -16903,7 +18074,14 @@
           <w:sz w:val="22"/>
           <w:szCs w:val="22"/>
         </w:rPr>
-        <w:t xml:space="preserve"> 00_Gestion_Proyecto/Documentos/Documento_Aprobado_Fase2.docx</w:t>
+        <w:t xml:space="preserve"> 00_Gestion_Proyecto/Documentos/Documento_Aprobado_F</w:t>
+      </w:r>
+      <w:r>
+        <w:rPr>
+          <w:sz w:val="22"/>
+          <w:szCs w:val="22"/>
+        </w:rPr>
+        <w:t>ase2.docx</w:t>
       </w:r>
     </w:p>
     <w:p>
@@ -16917,7 +18095,7 @@
       </w:pPr>
     </w:p>
     <w:sectPr>
-      <w:headerReference w:type="default" r:id="rId10"/>
+      <w:headerReference w:type="default" r:id="rId13"/>
       <w:pgSz w:w="12240" w:h="15840"/>
       <w:pgMar w:top="1843" w:right="1020" w:bottom="907" w:left="1020" w:header="720" w:footer="720" w:gutter="0"/>
       <w:pgNumType w:start="1"/>
@@ -16928,7 +18106,7 @@
 </file>
 
 <file path=word/endnotes.xml><?xml version="1.0" encoding="utf-8"?>
-<w:endnotes xmlns:wpc="http://schemas.microsoft.com/office/word/2010/wordprocessingCanvas" xmlns:cx="http://schemas.microsoft.com/office/drawing/2014/chartex" xmlns:cx1="http://schemas.microsoft.com/office/drawing/2015/9/8/chartex" xmlns:cx2="http://schemas.microsoft.com/office/drawing/2015/10/21/chartex" xmlns:cx3="http://schemas.microsoft.com/office/drawing/2016/5/9/chartex" xmlns:cx4="http://schemas.microsoft.com/office/drawing/2016/5/10/chartex" xmlns:cx5="http://schemas.microsoft.com/office/drawing/2016/5/11/chartex" xmlns:cx6="http://schemas.microsoft.com/office/drawing/2016/5/12/chartex" xmlns:cx7="http://schemas.microsoft.com/office/drawing/2016/5/13/chartex" xmlns:cx8="http://schemas.microsoft.com/office/drawing/2016/5/14/chartex" xmlns:mc="http://schemas.openxmlformats.org/markup-compatibility/2006" xmlns:aink="http://schemas.microsoft.com/office/drawing/2016/ink" xmlns:am3d="http://schemas.microsoft.com/office/drawing/2017/model3d" xmlns:o="urn:schemas-microsoft-com:office:office" xmlns:oel="http://schemas.microsoft.com/office/2019/extlst" xmlns:r="http://schemas.openxmlformats.org/officeDocument/2006/relationships" xmlns:m="http://schemas.openxmlformats.org/officeDocument/2006/math" xmlns:v="urn:schemas-microsoft-com:vml" xmlns:wp14="http://schemas.microsoft.com/office/word/2010/wordprocessingDrawing" xmlns:wp="http://schemas.openxmlformats.org/drawingml/2006/wordprocessingDrawing" xmlns:w10="urn:schemas-microsoft-com:office:word" xmlns:w="http://schemas.openxmlformats.org/wordprocessingml/2006/main" xmlns:w14="http://schemas.microsoft.com/office/word/2010/wordml" xmlns:w15="http://schemas.microsoft.com/office/word/2012/wordml" xmlns:w16cex="http://schemas.microsoft.com/office/word/2018/wordml/cex" xmlns:w16cid="http://schemas.microsoft.com/office/word/2016/wordml/cid" xmlns:w16="http://schemas.microsoft.com/office/word/2018/wordml" xmlns:w16du="http://schemas.microsoft.com/office/word/2023/wordml/word16du" xmlns:w16sdtdh="http://schemas.microsoft.com/office/word/2020/wordml/sdtdatahash" xmlns:w16sdtfl="http://schemas.microsoft.com/office/word/2024/wordml/sdtformatlock" xmlns:w16se="http://schemas.microsoft.com/office/word/2015/wordml/symex" xmlns:wpg="http://schemas.microsoft.com/office/word/2010/wordprocessingGroup" xmlns:wpi="http://schemas.microsoft.com/office/word/2010/wordprocessingInk" xmlns:wne="http://schemas.microsoft.com/office/word/2006/wordml" xmlns:wps="http://schemas.microsoft.com/office/word/2010/wordprocessingShape" mc:Ignorable="w14 w15 w16se w16cid w16 w16cex w16sdtdh w16sdtfl w16du wp14">
+<w:endnotes xmlns:wpc="http://schemas.microsoft.com/office/word/2010/wordprocessingCanvas" xmlns:cx="http://schemas.microsoft.com/office/drawing/2014/chartex" xmlns:cx1="http://schemas.microsoft.com/office/drawing/2015/9/8/chartex" xmlns:cx2="http://schemas.microsoft.com/office/drawing/2015/10/21/chartex" xmlns:cx3="http://schemas.microsoft.com/office/drawing/2016/5/9/chartex" xmlns:cx4="http://schemas.microsoft.com/office/drawing/2016/5/10/chartex" xmlns:cx5="http://schemas.microsoft.com/office/drawing/2016/5/11/chartex" xmlns:cx6="http://schemas.microsoft.com/office/drawing/2016/5/12/chartex" xmlns:cx7="http://schemas.microsoft.com/office/drawing/2016/5/13/chartex" xmlns:cx8="http://schemas.microsoft.com/office/drawing/2016/5/14/chartex" xmlns:mc="http://schemas.openxmlformats.org/markup-compatibility/2006" xmlns:aink="http://schemas.microsoft.com/office/drawing/2016/ink" xmlns:am3d="http://schemas.microsoft.com/office/drawing/2017/model3d" xmlns:o="urn:schemas-microsoft-com:office:office" xmlns:r="http://schemas.openxmlformats.org/officeDocument/2006/relationships" xmlns:m="http://schemas.openxmlformats.org/officeDocument/2006/math" xmlns:v="urn:schemas-microsoft-com:vml" xmlns:wp14="http://schemas.microsoft.com/office/word/2010/wordprocessingDrawing" xmlns:wp="http://schemas.openxmlformats.org/drawingml/2006/wordprocessingDrawing" xmlns:w10="urn:schemas-microsoft-com:office:word" xmlns:w="http://schemas.openxmlformats.org/wordprocessingml/2006/main" xmlns:w14="http://schemas.microsoft.com/office/word/2010/wordml" xmlns:w15="http://schemas.microsoft.com/office/word/2012/wordml" xmlns:w16cex="http://schemas.microsoft.com/office/word/2018/wordml/cex" xmlns:w16cid="http://schemas.microsoft.com/office/word/2016/wordml/cid" xmlns:w16="http://schemas.microsoft.com/office/word/2018/wordml" xmlns:w16sdtdh="http://schemas.microsoft.com/office/word/2020/wordml/sdtdatahash" xmlns:w16se="http://schemas.microsoft.com/office/word/2015/wordml/symex" xmlns:wpg="http://schemas.microsoft.com/office/word/2010/wordprocessingGroup" xmlns:wpi="http://schemas.microsoft.com/office/word/2010/wordprocessingInk" xmlns:wne="http://schemas.microsoft.com/office/word/2006/wordml" xmlns:wps="http://schemas.microsoft.com/office/word/2010/wordprocessingShape" mc:Ignorable="w14 w15 w16se w16cid w16 w16cex w16sdtdh wp14">
   <w:endnote w:type="separator" w:id="-1">
     <w:p>
       <w:pPr>
@@ -16953,7 +18131,7 @@
 </file>
 
 <file path=word/footnotes.xml><?xml version="1.0" encoding="utf-8"?>
-<w:footnotes xmlns:wpc="http://schemas.microsoft.com/office/word/2010/wordprocessingCanvas" xmlns:cx="http://schemas.microsoft.com/office/drawing/2014/chartex" xmlns:cx1="http://schemas.microsoft.com/office/drawing/2015/9/8/chartex" xmlns:cx2="http://schemas.microsoft.com/office/drawing/2015/10/21/chartex" xmlns:cx3="http://schemas.microsoft.com/office/drawing/2016/5/9/chartex" xmlns:cx4="http://schemas.microsoft.com/office/drawing/2016/5/10/chartex" xmlns:cx5="http://schemas.microsoft.com/office/drawing/2016/5/11/chartex" xmlns:cx6="http://schemas.microsoft.com/office/drawing/2016/5/12/chartex" xmlns:cx7="http://schemas.microsoft.com/office/drawing/2016/5/13/chartex" xmlns:cx8="http://schemas.microsoft.com/office/drawing/2016/5/14/chartex" xmlns:mc="http://schemas.openxmlformats.org/markup-compatibility/2006" xmlns:aink="http://schemas.microsoft.com/office/drawing/2016/ink" xmlns:am3d="http://schemas.microsoft.com/office/drawing/2017/model3d" xmlns:o="urn:schemas-microsoft-com:office:office" xmlns:oel="http://schemas.microsoft.com/office/2019/extlst" xmlns:r="http://schemas.openxmlformats.org/officeDocument/2006/relationships" xmlns:m="http://schemas.openxmlformats.org/officeDocument/2006/math" xmlns:v="urn:schemas-microsoft-com:vml" xmlns:wp14="http://schemas.microsoft.com/office/word/2010/wordprocessingDrawing" xmlns:wp="http://schemas.openxmlformats.org/drawingml/2006/wordprocessingDrawing" xmlns:w10="urn:schemas-microsoft-com:office:word" xmlns:w="http://schemas.openxmlformats.org/wordprocessingml/2006/main" xmlns:w14="http://schemas.microsoft.com/office/word/2010/wordml" xmlns:w15="http://schemas.microsoft.com/office/word/2012/wordml" xmlns:w16cex="http://schemas.microsoft.com/office/word/2018/wordml/cex" xmlns:w16cid="http://schemas.microsoft.com/office/word/2016/wordml/cid" xmlns:w16="http://schemas.microsoft.com/office/word/2018/wordml" xmlns:w16du="http://schemas.microsoft.com/office/word/2023/wordml/word16du" xmlns:w16sdtdh="http://schemas.microsoft.com/office/word/2020/wordml/sdtdatahash" xmlns:w16sdtfl="http://schemas.microsoft.com/office/word/2024/wordml/sdtformatlock" xmlns:w16se="http://schemas.microsoft.com/office/word/2015/wordml/symex" xmlns:wpg="http://schemas.microsoft.com/office/word/2010/wordprocessingGroup" xmlns:wpi="http://schemas.microsoft.com/office/word/2010/wordprocessingInk" xmlns:wne="http://schemas.microsoft.com/office/word/2006/wordml" xmlns:wps="http://schemas.microsoft.com/office/word/2010/wordprocessingShape" mc:Ignorable="w14 w15 w16se w16cid w16 w16cex w16sdtdh w16sdtfl w16du wp14">
+<w:footnotes xmlns:wpc="http://schemas.microsoft.com/office/word/2010/wordprocessingCanvas" xmlns:cx="http://schemas.microsoft.com/office/drawing/2014/chartex" xmlns:cx1="http://schemas.microsoft.com/office/drawing/2015/9/8/chartex" xmlns:cx2="http://schemas.microsoft.com/office/drawing/2015/10/21/chartex" xmlns:cx3="http://schemas.microsoft.com/office/drawing/2016/5/9/chartex" xmlns:cx4="http://schemas.microsoft.com/office/drawing/2016/5/10/chartex" xmlns:cx5="http://schemas.microsoft.com/office/drawing/2016/5/11/chartex" xmlns:cx6="http://schemas.microsoft.com/office/drawing/2016/5/12/chartex" xmlns:cx7="http://schemas.microsoft.com/office/drawing/2016/5/13/chartex" xmlns:cx8="http://schemas.microsoft.com/office/drawing/2016/5/14/chartex" xmlns:mc="http://schemas.openxmlformats.org/markup-compatibility/2006" xmlns:aink="http://schemas.microsoft.com/office/drawing/2016/ink" xmlns:am3d="http://schemas.microsoft.com/office/drawing/2017/model3d" xmlns:o="urn:schemas-microsoft-com:office:office" xmlns:r="http://schemas.openxmlformats.org/officeDocument/2006/relationships" xmlns:m="http://schemas.openxmlformats.org/officeDocument/2006/math" xmlns:v="urn:schemas-microsoft-com:vml" xmlns:wp14="http://schemas.microsoft.com/office/word/2010/wordprocessingDrawing" xmlns:wp="http://schemas.openxmlformats.org/drawingml/2006/wordprocessingDrawing" xmlns:w10="urn:schemas-microsoft-com:office:word" xmlns:w="http://schemas.openxmlformats.org/wordprocessingml/2006/main" xmlns:w14="http://schemas.microsoft.com/office/word/2010/wordml" xmlns:w15="http://schemas.microsoft.com/office/word/2012/wordml" xmlns:w16cex="http://schemas.microsoft.com/office/word/2018/wordml/cex" xmlns:w16cid="http://schemas.microsoft.com/office/word/2016/wordml/cid" xmlns:w16="http://schemas.microsoft.com/office/word/2018/wordml" xmlns:w16sdtdh="http://schemas.microsoft.com/office/word/2020/wordml/sdtdatahash" xmlns:w16se="http://schemas.microsoft.com/office/word/2015/wordml/symex" xmlns:wpg="http://schemas.microsoft.com/office/word/2010/wordprocessingGroup" xmlns:wpi="http://schemas.microsoft.com/office/word/2010/wordprocessingInk" xmlns:wne="http://schemas.microsoft.com/office/word/2006/wordml" xmlns:wps="http://schemas.microsoft.com/office/word/2010/wordprocessingShape" mc:Ignorable="w14 w15 w16se w16cid w16 w16cex w16sdtdh wp14">
   <w:footnote w:type="separator" w:id="-1">
     <w:p>
       <w:pPr>
@@ -16978,7 +18156,7 @@
 </file>
 
 <file path=word/header1.xml><?xml version="1.0" encoding="utf-8"?>
-<w:hdr xmlns:wpc="http://schemas.microsoft.com/office/word/2010/wordprocessingCanvas" xmlns:cx="http://schemas.microsoft.com/office/drawing/2014/chartex" xmlns:cx1="http://schemas.microsoft.com/office/drawing/2015/9/8/chartex" xmlns:cx2="http://schemas.microsoft.com/office/drawing/2015/10/21/chartex" xmlns:cx3="http://schemas.microsoft.com/office/drawing/2016/5/9/chartex" xmlns:cx4="http://schemas.microsoft.com/office/drawing/2016/5/10/chartex" xmlns:cx5="http://schemas.microsoft.com/office/drawing/2016/5/11/chartex" xmlns:cx6="http://schemas.microsoft.com/office/drawing/2016/5/12/chartex" xmlns:cx7="http://schemas.microsoft.com/office/drawing/2016/5/13/chartex" xmlns:cx8="http://schemas.microsoft.com/office/drawing/2016/5/14/chartex" xmlns:mc="http://schemas.openxmlformats.org/markup-compatibility/2006" xmlns:aink="http://schemas.microsoft.com/office/drawing/2016/ink" xmlns:am3d="http://schemas.microsoft.com/office/drawing/2017/model3d" xmlns:o="urn:schemas-microsoft-com:office:office" xmlns:oel="http://schemas.microsoft.com/office/2019/extlst" xmlns:r="http://schemas.openxmlformats.org/officeDocument/2006/relationships" xmlns:m="http://schemas.openxmlformats.org/officeDocument/2006/math" xmlns:v="urn:schemas-microsoft-com:vml" xmlns:wp14="http://schemas.microsoft.com/office/word/2010/wordprocessingDrawing" xmlns:wp="http://schemas.openxmlformats.org/drawingml/2006/wordprocessingDrawing" xmlns:w10="urn:schemas-microsoft-com:office:word" xmlns:w="http://schemas.openxmlformats.org/wordprocessingml/2006/main" xmlns:w14="http://schemas.microsoft.com/office/word/2010/wordml" xmlns:w15="http://schemas.microsoft.com/office/word/2012/wordml" xmlns:w16cex="http://schemas.microsoft.com/office/word/2018/wordml/cex" xmlns:w16cid="http://schemas.microsoft.com/office/word/2016/wordml/cid" xmlns:w16="http://schemas.microsoft.com/office/word/2018/wordml" xmlns:w16du="http://schemas.microsoft.com/office/word/2023/wordml/word16du" xmlns:w16sdtdh="http://schemas.microsoft.com/office/word/2020/wordml/sdtdatahash" xmlns:w16sdtfl="http://schemas.microsoft.com/office/word/2024/wordml/sdtformatlock" xmlns:w16se="http://schemas.microsoft.com/office/word/2015/wordml/symex" xmlns:wpg="http://schemas.microsoft.com/office/word/2010/wordprocessingGroup" xmlns:wpi="http://schemas.microsoft.com/office/word/2010/wordprocessingInk" xmlns:wne="http://schemas.microsoft.com/office/word/2006/wordml" xmlns:wps="http://schemas.microsoft.com/office/word/2010/wordprocessingShape" mc:Ignorable="w14 w15 w16se w16cid w16 w16cex w16sdtdh w16sdtfl w16du wp14">
+<w:hdr xmlns:wpc="http://schemas.microsoft.com/office/word/2010/wordprocessingCanvas" xmlns:cx="http://schemas.microsoft.com/office/drawing/2014/chartex" xmlns:cx1="http://schemas.microsoft.com/office/drawing/2015/9/8/chartex" xmlns:cx2="http://schemas.microsoft.com/office/drawing/2015/10/21/chartex" xmlns:cx3="http://schemas.microsoft.com/office/drawing/2016/5/9/chartex" xmlns:cx4="http://schemas.microsoft.com/office/drawing/2016/5/10/chartex" xmlns:cx5="http://schemas.microsoft.com/office/drawing/2016/5/11/chartex" xmlns:cx6="http://schemas.microsoft.com/office/drawing/2016/5/12/chartex" xmlns:cx7="http://schemas.microsoft.com/office/drawing/2016/5/13/chartex" xmlns:cx8="http://schemas.microsoft.com/office/drawing/2016/5/14/chartex" xmlns:mc="http://schemas.openxmlformats.org/markup-compatibility/2006" xmlns:aink="http://schemas.microsoft.com/office/drawing/2016/ink" xmlns:am3d="http://schemas.microsoft.com/office/drawing/2017/model3d" xmlns:o="urn:schemas-microsoft-com:office:office" xmlns:r="http://schemas.openxmlformats.org/officeDocument/2006/relationships" xmlns:m="http://schemas.openxmlformats.org/officeDocument/2006/math" xmlns:v="urn:schemas-microsoft-com:vml" xmlns:wp14="http://schemas.microsoft.com/office/word/2010/wordprocessingDrawing" xmlns:wp="http://schemas.openxmlformats.org/drawingml/2006/wordprocessingDrawing" xmlns:w10="urn:schemas-microsoft-com:office:word" xmlns:w="http://schemas.openxmlformats.org/wordprocessingml/2006/main" xmlns:w14="http://schemas.microsoft.com/office/word/2010/wordml" xmlns:w15="http://schemas.microsoft.com/office/word/2012/wordml" xmlns:w16cex="http://schemas.microsoft.com/office/word/2018/wordml/cex" xmlns:w16cid="http://schemas.microsoft.com/office/word/2016/wordml/cid" xmlns:w16="http://schemas.microsoft.com/office/word/2018/wordml" xmlns:w16sdtdh="http://schemas.microsoft.com/office/word/2020/wordml/sdtdatahash" xmlns:w16se="http://schemas.microsoft.com/office/word/2015/wordml/symex" xmlns:wpg="http://schemas.microsoft.com/office/word/2010/wordprocessingGroup" xmlns:wpi="http://schemas.microsoft.com/office/word/2010/wordprocessingInk" xmlns:wne="http://schemas.microsoft.com/office/word/2006/wordml" xmlns:wps="http://schemas.microsoft.com/office/word/2010/wordprocessingShape" mc:Ignorable="w14 w15 w16se w16cid w16 w16cex w16sdtdh wp14">
   <w:p>
     <w:pPr>
       <w:pBdr>
@@ -17050,7 +18228,7 @@
 </file>
 
 <file path=word/styles.xml><?xml version="1.0" encoding="utf-8"?>
-<w:styles xmlns:mc="http://schemas.openxmlformats.org/markup-compatibility/2006" xmlns:r="http://schemas.openxmlformats.org/officeDocument/2006/relationships" xmlns:w="http://schemas.openxmlformats.org/wordprocessingml/2006/main" xmlns:w14="http://schemas.microsoft.com/office/word/2010/wordml" xmlns:w15="http://schemas.microsoft.com/office/word/2012/wordml" xmlns:w16cex="http://schemas.microsoft.com/office/word/2018/wordml/cex" xmlns:w16cid="http://schemas.microsoft.com/office/word/2016/wordml/cid" xmlns:w16="http://schemas.microsoft.com/office/word/2018/wordml" xmlns:w16du="http://schemas.microsoft.com/office/word/2023/wordml/word16du" xmlns:w16sdtdh="http://schemas.microsoft.com/office/word/2020/wordml/sdtdatahash" xmlns:w16sdtfl="http://schemas.microsoft.com/office/word/2024/wordml/sdtformatlock" xmlns:w16se="http://schemas.microsoft.com/office/word/2015/wordml/symex" mc:Ignorable="w14 w15 w16se w16cid w16 w16cex w16sdtdh w16sdtfl w16du">
+<w:styles xmlns:mc="http://schemas.openxmlformats.org/markup-compatibility/2006" xmlns:r="http://schemas.openxmlformats.org/officeDocument/2006/relationships" xmlns:w="http://schemas.openxmlformats.org/wordprocessingml/2006/main" xmlns:w14="http://schemas.microsoft.com/office/word/2010/wordml" xmlns:w15="http://schemas.microsoft.com/office/word/2012/wordml" xmlns:w16cex="http://schemas.microsoft.com/office/word/2018/wordml/cex" xmlns:w16cid="http://schemas.microsoft.com/office/word/2016/wordml/cid" xmlns:w16="http://schemas.microsoft.com/office/word/2018/wordml" xmlns:w16sdtdh="http://schemas.microsoft.com/office/word/2020/wordml/sdtdatahash" xmlns:w16se="http://schemas.microsoft.com/office/word/2015/wordml/symex" mc:Ignorable="w14 w15 w16se w16cid w16 w16cex w16sdtdh">
   <w:docDefaults>
     <w:rPrDefault>
       <w:rPr>
@@ -17448,7 +18626,7 @@
     <w:name w:val="Normal"/>
     <w:qFormat/>
   </w:style>
-  <w:style w:type="paragraph" w:styleId="Heading1">
+  <w:style w:type="paragraph" w:styleId="Ttulo1">
     <w:name w:val="heading 1"/>
     <w:basedOn w:val="Normal"/>
     <w:next w:val="Normal"/>
@@ -17469,7 +18647,7 @@
       <w:szCs w:val="28"/>
     </w:rPr>
   </w:style>
-  <w:style w:type="paragraph" w:styleId="Heading2">
+  <w:style w:type="paragraph" w:styleId="Ttulo2">
     <w:name w:val="heading 2"/>
     <w:basedOn w:val="Normal"/>
     <w:next w:val="Normal"/>
@@ -17492,7 +18670,7 @@
       <w:szCs w:val="26"/>
     </w:rPr>
   </w:style>
-  <w:style w:type="paragraph" w:styleId="Heading3">
+  <w:style w:type="paragraph" w:styleId="Ttulo3">
     <w:name w:val="heading 3"/>
     <w:basedOn w:val="Normal"/>
     <w:next w:val="Normal"/>
@@ -17513,7 +18691,7 @@
       <w:color w:val="4F81BD"/>
     </w:rPr>
   </w:style>
-  <w:style w:type="paragraph" w:styleId="Heading4">
+  <w:style w:type="paragraph" w:styleId="Ttulo4">
     <w:name w:val="heading 4"/>
     <w:basedOn w:val="Normal"/>
     <w:next w:val="Normal"/>
@@ -17536,7 +18714,7 @@
       <w:color w:val="4F81BD"/>
     </w:rPr>
   </w:style>
-  <w:style w:type="paragraph" w:styleId="Heading5">
+  <w:style w:type="paragraph" w:styleId="Ttulo5">
     <w:name w:val="heading 5"/>
     <w:basedOn w:val="Normal"/>
     <w:next w:val="Normal"/>
@@ -17555,7 +18733,7 @@
       <w:color w:val="243F61"/>
     </w:rPr>
   </w:style>
-  <w:style w:type="paragraph" w:styleId="Heading6">
+  <w:style w:type="paragraph" w:styleId="Ttulo6">
     <w:name w:val="heading 6"/>
     <w:basedOn w:val="Normal"/>
     <w:next w:val="Normal"/>
@@ -17576,13 +18754,13 @@
       <w:color w:val="243F61"/>
     </w:rPr>
   </w:style>
-  <w:style w:type="character" w:default="1" w:styleId="DefaultParagraphFont">
+  <w:style w:type="character" w:default="1" w:styleId="Fuentedeprrafopredeter">
     <w:name w:val="Default Paragraph Font"/>
     <w:uiPriority w:val="1"/>
     <w:semiHidden/>
     <w:unhideWhenUsed/>
   </w:style>
-  <w:style w:type="table" w:default="1" w:styleId="TableNormal">
+  <w:style w:type="table" w:default="1" w:styleId="Tablanormal">
     <w:name w:val="Normal Table"/>
     <w:uiPriority w:val="99"/>
     <w:semiHidden/>
@@ -17597,13 +18775,13 @@
       </w:tblCellMar>
     </w:tblPr>
   </w:style>
-  <w:style w:type="numbering" w:default="1" w:styleId="NoList">
+  <w:style w:type="numbering" w:default="1" w:styleId="Sinlista">
     <w:name w:val="No List"/>
     <w:uiPriority w:val="99"/>
     <w:semiHidden/>
     <w:unhideWhenUsed/>
   </w:style>
-  <w:style w:type="table" w:customStyle="1" w:styleId="TableNormal0">
+  <w:style w:type="table" w:customStyle="1" w:styleId="TableNormal">
     <w:name w:val="TableNormal"/>
     <w:tblPr>
       <w:tblCellMar>
@@ -17614,7 +18792,7 @@
       </w:tblCellMar>
     </w:tblPr>
   </w:style>
-  <w:style w:type="paragraph" w:styleId="Title">
+  <w:style w:type="paragraph" w:styleId="Ttulo">
     <w:name w:val="Title"/>
     <w:basedOn w:val="Normal"/>
     <w:next w:val="Normal"/>
@@ -17633,7 +18811,7 @@
       <w:szCs w:val="52"/>
     </w:rPr>
   </w:style>
-  <w:style w:type="paragraph" w:styleId="Subtitle">
+  <w:style w:type="paragraph" w:styleId="Subttulo">
     <w:name w:val="Subtitle"/>
     <w:basedOn w:val="Normal"/>
     <w:next w:val="Normal"/>
@@ -17649,7 +18827,7 @@
     </w:rPr>
   </w:style>
   <w:style w:type="table" w:customStyle="1" w:styleId="a">
-    <w:basedOn w:val="TableNormal0"/>
+    <w:basedOn w:val="TableNormal"/>
     <w:tblPr>
       <w:tblStyleRowBandSize w:val="1"/>
       <w:tblStyleColBandSize w:val="1"/>
@@ -17662,7 +18840,7 @@
     </w:tblPr>
   </w:style>
   <w:style w:type="table" w:customStyle="1" w:styleId="a0">
-    <w:basedOn w:val="TableNormal0"/>
+    <w:basedOn w:val="TableNormal"/>
     <w:pPr>
       <w:spacing w:after="0" w:line="240" w:lineRule="auto"/>
     </w:pPr>
@@ -17678,7 +18856,7 @@
     </w:tblPr>
   </w:style>
   <w:style w:type="table" w:customStyle="1" w:styleId="a1">
-    <w:basedOn w:val="TableNormal0"/>
+    <w:basedOn w:val="TableNormal"/>
     <w:tblPr>
       <w:tblStyleRowBandSize w:val="1"/>
       <w:tblStyleColBandSize w:val="1"/>
@@ -17691,7 +18869,7 @@
     </w:tblPr>
   </w:style>
   <w:style w:type="table" w:customStyle="1" w:styleId="a2">
-    <w:basedOn w:val="TableNormal0"/>
+    <w:basedOn w:val="TableNormal"/>
     <w:tblPr>
       <w:tblStyleRowBandSize w:val="1"/>
       <w:tblStyleColBandSize w:val="1"/>
@@ -17704,7 +18882,7 @@
     </w:tblPr>
   </w:style>
   <w:style w:type="table" w:customStyle="1" w:styleId="a3">
-    <w:basedOn w:val="TableNormal0"/>
+    <w:basedOn w:val="TableNormal"/>
     <w:tblPr>
       <w:tblStyleRowBandSize w:val="1"/>
       <w:tblStyleColBandSize w:val="1"/>
@@ -17717,7 +18895,7 @@
     </w:tblPr>
   </w:style>
   <w:style w:type="table" w:customStyle="1" w:styleId="a4">
-    <w:basedOn w:val="TableNormal0"/>
+    <w:basedOn w:val="TableNormal"/>
     <w:tblPr>
       <w:tblStyleRowBandSize w:val="1"/>
       <w:tblStyleColBandSize w:val="1"/>
@@ -17730,7 +18908,7 @@
     </w:tblPr>
   </w:style>
   <w:style w:type="table" w:customStyle="1" w:styleId="a5">
-    <w:basedOn w:val="TableNormal0"/>
+    <w:basedOn w:val="TableNormal"/>
     <w:tblPr>
       <w:tblStyleRowBandSize w:val="1"/>
       <w:tblStyleColBandSize w:val="1"/>
@@ -17743,7 +18921,7 @@
     </w:tblPr>
   </w:style>
   <w:style w:type="table" w:customStyle="1" w:styleId="a6">
-    <w:basedOn w:val="TableNormal0"/>
+    <w:basedOn w:val="TableNormal"/>
     <w:tblPr>
       <w:tblStyleRowBandSize w:val="1"/>
       <w:tblStyleColBandSize w:val="1"/>
@@ -17756,7 +18934,7 @@
     </w:tblPr>
   </w:style>
   <w:style w:type="table" w:customStyle="1" w:styleId="a7">
-    <w:basedOn w:val="TableNormal0"/>
+    <w:basedOn w:val="TableNormal"/>
     <w:tblPr>
       <w:tblStyleRowBandSize w:val="1"/>
       <w:tblStyleColBandSize w:val="1"/>
@@ -17769,7 +18947,7 @@
     </w:tblPr>
   </w:style>
   <w:style w:type="table" w:customStyle="1" w:styleId="a8">
-    <w:basedOn w:val="TableNormal0"/>
+    <w:basedOn w:val="TableNormal"/>
     <w:tblPr>
       <w:tblStyleRowBandSize w:val="1"/>
       <w:tblStyleColBandSize w:val="1"/>
@@ -17782,7 +18960,7 @@
     </w:tblPr>
   </w:style>
   <w:style w:type="table" w:customStyle="1" w:styleId="a9">
-    <w:basedOn w:val="TableNormal0"/>
+    <w:basedOn w:val="TableNormal"/>
     <w:tblPr>
       <w:tblStyleRowBandSize w:val="1"/>
       <w:tblStyleColBandSize w:val="1"/>
@@ -17795,7 +18973,7 @@
     </w:tblPr>
   </w:style>
   <w:style w:type="table" w:customStyle="1" w:styleId="aa">
-    <w:basedOn w:val="TableNormal0"/>
+    <w:basedOn w:val="TableNormal"/>
     <w:tblPr>
       <w:tblStyleRowBandSize w:val="1"/>
       <w:tblStyleColBandSize w:val="1"/>
@@ -17808,7 +18986,7 @@
     </w:tblPr>
   </w:style>
   <w:style w:type="table" w:customStyle="1" w:styleId="ab">
-    <w:basedOn w:val="TableNormal0"/>
+    <w:basedOn w:val="TableNormal"/>
     <w:tblPr>
       <w:tblStyleRowBandSize w:val="1"/>
       <w:tblStyleColBandSize w:val="1"/>
@@ -17821,7 +18999,7 @@
     </w:tblPr>
   </w:style>
   <w:style w:type="table" w:customStyle="1" w:styleId="ac">
-    <w:basedOn w:val="TableNormal0"/>
+    <w:basedOn w:val="TableNormal"/>
     <w:tblPr>
       <w:tblStyleRowBandSize w:val="1"/>
       <w:tblStyleColBandSize w:val="1"/>
@@ -17834,7 +19012,7 @@
     </w:tblPr>
   </w:style>
   <w:style w:type="table" w:customStyle="1" w:styleId="ad">
-    <w:basedOn w:val="TableNormal0"/>
+    <w:basedOn w:val="TableNormal"/>
     <w:tblPr>
       <w:tblStyleRowBandSize w:val="1"/>
       <w:tblStyleColBandSize w:val="1"/>
@@ -17847,7 +19025,7 @@
     </w:tblPr>
   </w:style>
   <w:style w:type="table" w:customStyle="1" w:styleId="ae">
-    <w:basedOn w:val="TableNormal0"/>
+    <w:basedOn w:val="TableNormal"/>
     <w:tblPr>
       <w:tblStyleRowBandSize w:val="1"/>
       <w:tblStyleColBandSize w:val="1"/>
@@ -17860,7 +19038,7 @@
     </w:tblPr>
   </w:style>
   <w:style w:type="table" w:customStyle="1" w:styleId="af">
-    <w:basedOn w:val="TableNormal0"/>
+    <w:basedOn w:val="TableNormal"/>
     <w:tblPr>
       <w:tblStyleRowBandSize w:val="1"/>
       <w:tblStyleColBandSize w:val="1"/>
@@ -17873,7 +19051,7 @@
     </w:tblPr>
   </w:style>
   <w:style w:type="table" w:customStyle="1" w:styleId="af0">
-    <w:basedOn w:val="TableNormal0"/>
+    <w:basedOn w:val="TableNormal"/>
     <w:tblPr>
       <w:tblStyleRowBandSize w:val="1"/>
       <w:tblStyleColBandSize w:val="1"/>
@@ -17886,7 +19064,7 @@
     </w:tblPr>
   </w:style>
   <w:style w:type="table" w:customStyle="1" w:styleId="af1">
-    <w:basedOn w:val="TableNormal0"/>
+    <w:basedOn w:val="TableNormal"/>
     <w:tblPr>
       <w:tblStyleRowBandSize w:val="1"/>
       <w:tblStyleColBandSize w:val="1"/>
@@ -17899,7 +19077,7 @@
     </w:tblPr>
   </w:style>
   <w:style w:type="table" w:customStyle="1" w:styleId="af2">
-    <w:basedOn w:val="TableNormal0"/>
+    <w:basedOn w:val="TableNormal"/>
     <w:tblPr>
       <w:tblStyleRowBandSize w:val="1"/>
       <w:tblStyleColBandSize w:val="1"/>
@@ -17912,7 +19090,7 @@
     </w:tblPr>
   </w:style>
   <w:style w:type="table" w:customStyle="1" w:styleId="af3">
-    <w:basedOn w:val="TableNormal0"/>
+    <w:basedOn w:val="TableNormal"/>
     <w:tblPr>
       <w:tblStyleRowBandSize w:val="1"/>
       <w:tblStyleColBandSize w:val="1"/>
@@ -17925,7 +19103,7 @@
     </w:tblPr>
   </w:style>
   <w:style w:type="table" w:customStyle="1" w:styleId="af4">
-    <w:basedOn w:val="TableNormal0"/>
+    <w:basedOn w:val="TableNormal"/>
     <w:tblPr>
       <w:tblStyleRowBandSize w:val="1"/>
       <w:tblStyleColBandSize w:val="1"/>
@@ -17938,7 +19116,7 @@
     </w:tblPr>
   </w:style>
   <w:style w:type="table" w:customStyle="1" w:styleId="af5">
-    <w:basedOn w:val="TableNormal0"/>
+    <w:basedOn w:val="TableNormal"/>
     <w:tblPr>
       <w:tblStyleRowBandSize w:val="1"/>
       <w:tblStyleColBandSize w:val="1"/>
@@ -17951,7 +19129,7 @@
     </w:tblPr>
   </w:style>
   <w:style w:type="table" w:customStyle="1" w:styleId="af6">
-    <w:basedOn w:val="TableNormal0"/>
+    <w:basedOn w:val="TableNormal"/>
     <w:tblPr>
       <w:tblStyleRowBandSize w:val="1"/>
       <w:tblStyleColBandSize w:val="1"/>
@@ -17964,7 +19142,7 @@
     </w:tblPr>
   </w:style>
   <w:style w:type="table" w:customStyle="1" w:styleId="af7">
-    <w:basedOn w:val="TableNormal0"/>
+    <w:basedOn w:val="TableNormal"/>
     <w:tblPr>
       <w:tblStyleRowBandSize w:val="1"/>
       <w:tblStyleColBandSize w:val="1"/>
@@ -17977,7 +19155,7 @@
     </w:tblPr>
   </w:style>
   <w:style w:type="table" w:customStyle="1" w:styleId="af8">
-    <w:basedOn w:val="TableNormal0"/>
+    <w:basedOn w:val="TableNormal"/>
     <w:tblPr>
       <w:tblStyleRowBandSize w:val="1"/>
       <w:tblStyleColBandSize w:val="1"/>
@@ -17990,7 +19168,7 @@
     </w:tblPr>
   </w:style>
   <w:style w:type="table" w:customStyle="1" w:styleId="af9">
-    <w:basedOn w:val="TableNormal0"/>
+    <w:basedOn w:val="TableNormal"/>
     <w:tblPr>
       <w:tblStyleRowBandSize w:val="1"/>
       <w:tblStyleColBandSize w:val="1"/>
@@ -18003,7 +19181,7 @@
     </w:tblPr>
   </w:style>
   <w:style w:type="table" w:customStyle="1" w:styleId="afa">
-    <w:basedOn w:val="TableNormal0"/>
+    <w:basedOn w:val="TableNormal"/>
     <w:tblPr>
       <w:tblStyleRowBandSize w:val="1"/>
       <w:tblStyleColBandSize w:val="1"/>
@@ -18016,7 +19194,7 @@
     </w:tblPr>
   </w:style>
   <w:style w:type="table" w:customStyle="1" w:styleId="afb">
-    <w:basedOn w:val="TableNormal0"/>
+    <w:basedOn w:val="TableNormal"/>
     <w:tblPr>
       <w:tblStyleRowBandSize w:val="1"/>
       <w:tblStyleColBandSize w:val="1"/>
@@ -18029,7 +19207,7 @@
     </w:tblPr>
   </w:style>
   <w:style w:type="table" w:customStyle="1" w:styleId="afc">
-    <w:basedOn w:val="TableNormal0"/>
+    <w:basedOn w:val="TableNormal"/>
     <w:tblPr>
       <w:tblStyleRowBandSize w:val="1"/>
       <w:tblStyleColBandSize w:val="1"/>
@@ -18042,7 +19220,7 @@
     </w:tblPr>
   </w:style>
   <w:style w:type="table" w:customStyle="1" w:styleId="afd">
-    <w:basedOn w:val="TableNormal0"/>
+    <w:basedOn w:val="TableNormal"/>
     <w:tblPr>
       <w:tblStyleRowBandSize w:val="1"/>
       <w:tblStyleColBandSize w:val="1"/>
@@ -18055,7 +19233,7 @@
     </w:tblPr>
   </w:style>
   <w:style w:type="table" w:customStyle="1" w:styleId="afe">
-    <w:basedOn w:val="TableNormal0"/>
+    <w:basedOn w:val="TableNormal"/>
     <w:tblPr>
       <w:tblStyleRowBandSize w:val="1"/>
       <w:tblStyleColBandSize w:val="1"/>
@@ -18068,7 +19246,7 @@
     </w:tblPr>
   </w:style>
   <w:style w:type="table" w:customStyle="1" w:styleId="aff">
-    <w:basedOn w:val="TableNormal0"/>
+    <w:basedOn w:val="TableNormal"/>
     <w:tblPr>
       <w:tblStyleRowBandSize w:val="1"/>
       <w:tblStyleColBandSize w:val="1"/>
@@ -18081,7 +19259,7 @@
     </w:tblPr>
   </w:style>
   <w:style w:type="table" w:customStyle="1" w:styleId="aff0">
-    <w:basedOn w:val="TableNormal0"/>
+    <w:basedOn w:val="TableNormal"/>
     <w:tblPr>
       <w:tblStyleRowBandSize w:val="1"/>
       <w:tblStyleColBandSize w:val="1"/>
@@ -18092,6 +19270,29 @@
         <w:right w:w="115" w:type="dxa"/>
       </w:tblCellMar>
     </w:tblPr>
+  </w:style>
+  <w:style w:type="character" w:styleId="Hipervnculo">
+    <w:name w:val="Hyperlink"/>
+    <w:basedOn w:val="Fuentedeprrafopredeter"/>
+    <w:uiPriority w:val="99"/>
+    <w:unhideWhenUsed/>
+    <w:rsid w:val="00D922FB"/>
+    <w:rPr>
+      <w:color w:val="0000FF" w:themeColor="hyperlink"/>
+      <w:u w:val="single"/>
+    </w:rPr>
+  </w:style>
+  <w:style w:type="character" w:styleId="Mencinsinresolver">
+    <w:name w:val="Unresolved Mention"/>
+    <w:basedOn w:val="Fuentedeprrafopredeter"/>
+    <w:uiPriority w:val="99"/>
+    <w:semiHidden/>
+    <w:unhideWhenUsed/>
+    <w:rsid w:val="00D922FB"/>
+    <w:rPr>
+      <w:color w:val="605E5C"/>
+      <w:shd w:val="clear" w:color="auto" w:fill="E1DFDD"/>
+    </w:rPr>
   </w:style>
 </w:styles>
 </file>

</xml_diff>